<commit_message>
Created ER diageram and wireframes (#9)
* feature/Documents-ER

* feature/Documents-Wireframes
</commit_message>
<xml_diff>
--- a/Documents/UseCase.docx
+++ b/Documents/UseCase.docx
@@ -4866,12 +4866,12 @@
           <wp:inline distB="114300" distT="114300" distL="114300" distR="114300">
             <wp:extent cx="6120455" cy="6261100"/>
             <wp:effectExtent b="0" l="0" r="0" t="0"/>
-            <wp:docPr id="5" name="image1.png"/>
+            <wp:docPr id="5" name="image9.png"/>
             <a:graphic>
               <a:graphicData uri="http://schemas.openxmlformats.org/drawingml/2006/picture">
                 <pic:pic>
                   <pic:nvPicPr>
-                    <pic:cNvPr id="0" name="image1.png"/>
+                    <pic:cNvPr id="0" name="image9.png"/>
                     <pic:cNvPicPr preferRelativeResize="0"/>
                   </pic:nvPicPr>
                   <pic:blipFill>
@@ -4993,6 +4993,2748 @@
     </w:p>
     <w:p>
       <w:pPr>
+        <w:widowControl w:val="0"/>
+        <w:spacing w:after="0" w:line="276" w:lineRule="auto"/>
+        <w:ind w:right="-720"/>
+        <w:rPr>
+          <w:rFonts w:ascii="Arial" w:cs="Arial" w:eastAsia="Arial" w:hAnsi="Arial"/>
+          <w:sz w:val="22"/>
+          <w:szCs w:val="22"/>
+        </w:rPr>
+      </w:pPr>
+      <w:r>
+        <w:rPr>
+          <w:rtl w:val="0"/>
+        </w:rPr>
+      </w:r>
+    </w:p>
+    <w:p>
+      <w:pPr>
+        <w:widowControl w:val="0"/>
+        <w:spacing w:after="0" w:line="276" w:lineRule="auto"/>
+        <w:ind w:right="-720"/>
+        <w:rPr>
+          <w:rFonts w:ascii="Arial" w:cs="Arial" w:eastAsia="Arial" w:hAnsi="Arial"/>
+          <w:sz w:val="22"/>
+          <w:szCs w:val="22"/>
+        </w:rPr>
+      </w:pPr>
+      <w:r>
+        <w:rPr>
+          <w:rtl w:val="0"/>
+        </w:rPr>
+      </w:r>
+    </w:p>
+    <w:tbl>
+      <w:tblPr>
+        <w:tblStyle w:val="Table3"/>
+        <w:tblW w:w="10185.0" w:type="dxa"/>
+        <w:jc w:val="left"/>
+        <w:tblInd w:w="15.0" w:type="dxa"/>
+        <w:tblBorders>
+          <w:top w:color="000000" w:space="0" w:sz="4" w:val="single"/>
+          <w:left w:color="000000" w:space="0" w:sz="4" w:val="single"/>
+          <w:bottom w:color="000000" w:space="0" w:sz="4" w:val="single"/>
+          <w:right w:color="000000" w:space="0" w:sz="4" w:val="single"/>
+          <w:insideH w:color="000000" w:space="0" w:sz="4" w:val="single"/>
+          <w:insideV w:color="000000" w:space="0" w:sz="4" w:val="single"/>
+        </w:tblBorders>
+        <w:tblLayout w:type="fixed"/>
+        <w:tblLook w:val="0000"/>
+      </w:tblPr>
+      <w:tblGrid>
+        <w:gridCol w:w="1845"/>
+        <w:gridCol w:w="8340"/>
+        <w:tblGridChange w:id="0">
+          <w:tblGrid>
+            <w:gridCol w:w="1845"/>
+            <w:gridCol w:w="8340"/>
+          </w:tblGrid>
+        </w:tblGridChange>
+      </w:tblGrid>
+      <w:tr>
+        <w:trPr>
+          <w:cantSplit w:val="0"/>
+          <w:tblHeader w:val="1"/>
+        </w:trPr>
+        <w:tc>
+          <w:tcPr>
+            <w:tcBorders>
+              <w:top w:color="000000" w:space="0" w:sz="4" w:val="single"/>
+              <w:left w:color="000000" w:space="0" w:sz="4" w:val="single"/>
+              <w:bottom w:color="000000" w:space="0" w:sz="4" w:val="single"/>
+              <w:right w:color="000000" w:space="0" w:sz="4" w:val="single"/>
+            </w:tcBorders>
+            <w:shd w:fill="f2f2f2" w:val="clear"/>
+            <w:tcMar>
+              <w:top w:w="60.0" w:type="dxa"/>
+              <w:left w:w="100.0" w:type="dxa"/>
+              <w:bottom w:w="60.0" w:type="dxa"/>
+              <w:right w:w="100.0" w:type="dxa"/>
+            </w:tcMar>
+            <w:vAlign w:val="center"/>
+          </w:tcPr>
+          <w:p>
+            <w:pPr>
+              <w:spacing w:after="0" w:line="240" w:lineRule="auto"/>
+              <w:jc w:val="center"/>
+              <w:rPr>
+                <w:rFonts w:ascii="Arial" w:cs="Arial" w:eastAsia="Arial" w:hAnsi="Arial"/>
+                <w:sz w:val="22"/>
+                <w:szCs w:val="22"/>
+              </w:rPr>
+            </w:pPr>
+            <w:r>
+              <w:rPr>
+                <w:rFonts w:ascii="Arial" w:cs="Arial" w:eastAsia="Arial" w:hAnsi="Arial"/>
+                <w:sz w:val="22"/>
+                <w:szCs w:val="22"/>
+                <w:rtl w:val="0"/>
+              </w:rPr>
+              <w:t xml:space="preserve">Роль</w:t>
+            </w:r>
+          </w:p>
+        </w:tc>
+        <w:tc>
+          <w:tcPr>
+            <w:tcBorders>
+              <w:top w:color="000000" w:space="0" w:sz="4" w:val="single"/>
+              <w:left w:color="000000" w:space="0" w:sz="4" w:val="single"/>
+              <w:bottom w:color="000000" w:space="0" w:sz="4" w:val="single"/>
+              <w:right w:color="000000" w:space="0" w:sz="4" w:val="single"/>
+            </w:tcBorders>
+            <w:shd w:fill="f2f2f2" w:val="clear"/>
+            <w:tcMar>
+              <w:top w:w="60.0" w:type="dxa"/>
+              <w:left w:w="100.0" w:type="dxa"/>
+              <w:bottom w:w="60.0" w:type="dxa"/>
+              <w:right w:w="100.0" w:type="dxa"/>
+            </w:tcMar>
+            <w:vAlign w:val="center"/>
+          </w:tcPr>
+          <w:p>
+            <w:pPr>
+              <w:spacing w:after="0" w:line="240" w:lineRule="auto"/>
+              <w:rPr>
+                <w:rFonts w:ascii="Arial" w:cs="Arial" w:eastAsia="Arial" w:hAnsi="Arial"/>
+                <w:sz w:val="22"/>
+                <w:szCs w:val="22"/>
+              </w:rPr>
+            </w:pPr>
+            <w:r>
+              <w:rPr>
+                <w:rFonts w:ascii="Arial" w:cs="Arial" w:eastAsia="Arial" w:hAnsi="Arial"/>
+                <w:sz w:val="22"/>
+                <w:szCs w:val="22"/>
+                <w:rtl w:val="0"/>
+              </w:rPr>
+              <w:t xml:space="preserve">User Story</w:t>
+            </w:r>
+          </w:p>
+        </w:tc>
+      </w:tr>
+      <w:tr>
+        <w:trPr>
+          <w:cantSplit w:val="0"/>
+          <w:tblHeader w:val="0"/>
+        </w:trPr>
+        <w:tc>
+          <w:tcPr>
+            <w:vMerge w:val="restart"/>
+            <w:tcBorders>
+              <w:top w:color="000000" w:space="0" w:sz="4" w:val="single"/>
+              <w:left w:color="000000" w:space="0" w:sz="4" w:val="single"/>
+              <w:bottom w:color="000000" w:space="0" w:sz="4" w:val="single"/>
+              <w:right w:color="000000" w:space="0" w:sz="4" w:val="single"/>
+            </w:tcBorders>
+            <w:shd w:fill="ffffff" w:val="clear"/>
+            <w:tcMar>
+              <w:top w:w="60.0" w:type="dxa"/>
+              <w:left w:w="100.0" w:type="dxa"/>
+              <w:bottom w:w="60.0" w:type="dxa"/>
+              <w:right w:w="100.0" w:type="dxa"/>
+            </w:tcMar>
+            <w:vAlign w:val="center"/>
+          </w:tcPr>
+          <w:p>
+            <w:pPr>
+              <w:spacing w:after="0" w:line="240" w:lineRule="auto"/>
+              <w:jc w:val="center"/>
+              <w:rPr>
+                <w:rFonts w:ascii="Arial" w:cs="Arial" w:eastAsia="Arial" w:hAnsi="Arial"/>
+                <w:sz w:val="22"/>
+                <w:szCs w:val="22"/>
+              </w:rPr>
+            </w:pPr>
+            <w:r>
+              <w:rPr>
+                <w:rFonts w:ascii="Arial" w:cs="Arial" w:eastAsia="Arial" w:hAnsi="Arial"/>
+                <w:sz w:val="22"/>
+                <w:szCs w:val="22"/>
+                <w:rtl w:val="0"/>
+              </w:rPr>
+              <w:t xml:space="preserve">Студент</w:t>
+            </w:r>
+          </w:p>
+        </w:tc>
+        <w:tc>
+          <w:tcPr>
+            <w:tcBorders>
+              <w:top w:color="000000" w:space="0" w:sz="4" w:val="single"/>
+              <w:left w:color="000000" w:space="0" w:sz="4" w:val="single"/>
+              <w:bottom w:color="000000" w:space="0" w:sz="4" w:val="single"/>
+              <w:right w:color="000000" w:space="0" w:sz="4" w:val="single"/>
+            </w:tcBorders>
+            <w:shd w:fill="ffffff" w:val="clear"/>
+            <w:tcMar>
+              <w:top w:w="60.0" w:type="dxa"/>
+              <w:left w:w="100.0" w:type="dxa"/>
+              <w:bottom w:w="60.0" w:type="dxa"/>
+              <w:right w:w="100.0" w:type="dxa"/>
+            </w:tcMar>
+            <w:vAlign w:val="center"/>
+          </w:tcPr>
+          <w:p>
+            <w:pPr>
+              <w:spacing w:after="0" w:line="240" w:lineRule="auto"/>
+              <w:rPr>
+                <w:rFonts w:ascii="Arial" w:cs="Arial" w:eastAsia="Arial" w:hAnsi="Arial"/>
+                <w:sz w:val="22"/>
+                <w:szCs w:val="22"/>
+              </w:rPr>
+            </w:pPr>
+            <w:r>
+              <w:rPr>
+                <w:rFonts w:ascii="Arial" w:cs="Arial" w:eastAsia="Arial" w:hAnsi="Arial"/>
+                <w:sz w:val="22"/>
+                <w:szCs w:val="22"/>
+                <w:rtl w:val="0"/>
+              </w:rPr>
+              <w:t xml:space="preserve">Зареєструватись через корпоративний обліковий запис Microsoft, щоб отримати доступ до системи.</w:t>
+            </w:r>
+          </w:p>
+        </w:tc>
+      </w:tr>
+      <w:tr>
+        <w:trPr>
+          <w:cantSplit w:val="0"/>
+          <w:tblHeader w:val="0"/>
+        </w:trPr>
+        <w:tc>
+          <w:tcPr>
+            <w:vMerge w:val="continue"/>
+            <w:tcBorders>
+              <w:top w:color="000000" w:space="0" w:sz="4" w:val="single"/>
+              <w:left w:color="000000" w:space="0" w:sz="4" w:val="single"/>
+              <w:bottom w:color="000000" w:space="0" w:sz="4" w:val="single"/>
+              <w:right w:color="000000" w:space="0" w:sz="4" w:val="single"/>
+            </w:tcBorders>
+            <w:shd w:fill="ffffff" w:val="clear"/>
+            <w:tcMar>
+              <w:top w:w="60.0" w:type="dxa"/>
+              <w:left w:w="100.0" w:type="dxa"/>
+              <w:bottom w:w="60.0" w:type="dxa"/>
+              <w:right w:w="100.0" w:type="dxa"/>
+            </w:tcMar>
+            <w:vAlign w:val="center"/>
+          </w:tcPr>
+          <w:p>
+            <w:pPr>
+              <w:widowControl w:val="0"/>
+              <w:spacing w:after="0" w:line="276" w:lineRule="auto"/>
+              <w:rPr>
+                <w:rFonts w:ascii="Arial" w:cs="Arial" w:eastAsia="Arial" w:hAnsi="Arial"/>
+                <w:sz w:val="22"/>
+                <w:szCs w:val="22"/>
+              </w:rPr>
+            </w:pPr>
+            <w:r>
+              <w:rPr>
+                <w:rtl w:val="0"/>
+              </w:rPr>
+            </w:r>
+          </w:p>
+        </w:tc>
+        <w:tc>
+          <w:tcPr>
+            <w:tcBorders>
+              <w:top w:color="000000" w:space="0" w:sz="4" w:val="single"/>
+              <w:left w:color="000000" w:space="0" w:sz="4" w:val="single"/>
+              <w:bottom w:color="000000" w:space="0" w:sz="4" w:val="single"/>
+              <w:right w:color="000000" w:space="0" w:sz="4" w:val="single"/>
+            </w:tcBorders>
+            <w:shd w:fill="ffffff" w:val="clear"/>
+            <w:tcMar>
+              <w:top w:w="60.0" w:type="dxa"/>
+              <w:left w:w="100.0" w:type="dxa"/>
+              <w:bottom w:w="60.0" w:type="dxa"/>
+              <w:right w:w="100.0" w:type="dxa"/>
+            </w:tcMar>
+            <w:vAlign w:val="center"/>
+          </w:tcPr>
+          <w:p>
+            <w:pPr>
+              <w:spacing w:after="0" w:line="240" w:lineRule="auto"/>
+              <w:rPr>
+                <w:rFonts w:ascii="Arial" w:cs="Arial" w:eastAsia="Arial" w:hAnsi="Arial"/>
+                <w:sz w:val="22"/>
+                <w:szCs w:val="22"/>
+              </w:rPr>
+            </w:pPr>
+            <w:r>
+              <w:rPr>
+                <w:rFonts w:ascii="Arial" w:cs="Arial" w:eastAsia="Arial" w:hAnsi="Arial"/>
+                <w:sz w:val="22"/>
+                <w:szCs w:val="22"/>
+                <w:rtl w:val="0"/>
+              </w:rPr>
+              <w:t xml:space="preserve">Увійти у свій профіль через Microsoft OAuth, щоб отримати доступ до функцій застосунку.</w:t>
+            </w:r>
+          </w:p>
+        </w:tc>
+      </w:tr>
+      <w:tr>
+        <w:trPr>
+          <w:cantSplit w:val="0"/>
+          <w:tblHeader w:val="0"/>
+        </w:trPr>
+        <w:tc>
+          <w:tcPr>
+            <w:vMerge w:val="continue"/>
+            <w:tcBorders>
+              <w:top w:color="000000" w:space="0" w:sz="4" w:val="single"/>
+              <w:left w:color="000000" w:space="0" w:sz="4" w:val="single"/>
+              <w:bottom w:color="000000" w:space="0" w:sz="4" w:val="single"/>
+              <w:right w:color="000000" w:space="0" w:sz="4" w:val="single"/>
+            </w:tcBorders>
+            <w:shd w:fill="ffffff" w:val="clear"/>
+            <w:tcMar>
+              <w:top w:w="60.0" w:type="dxa"/>
+              <w:left w:w="100.0" w:type="dxa"/>
+              <w:bottom w:w="60.0" w:type="dxa"/>
+              <w:right w:w="100.0" w:type="dxa"/>
+            </w:tcMar>
+            <w:vAlign w:val="center"/>
+          </w:tcPr>
+          <w:p>
+            <w:pPr>
+              <w:widowControl w:val="0"/>
+              <w:spacing w:after="0" w:line="276" w:lineRule="auto"/>
+              <w:rPr>
+                <w:rFonts w:ascii="Arial" w:cs="Arial" w:eastAsia="Arial" w:hAnsi="Arial"/>
+                <w:sz w:val="22"/>
+                <w:szCs w:val="22"/>
+              </w:rPr>
+            </w:pPr>
+            <w:r>
+              <w:rPr>
+                <w:rtl w:val="0"/>
+              </w:rPr>
+            </w:r>
+          </w:p>
+        </w:tc>
+        <w:tc>
+          <w:tcPr>
+            <w:tcBorders>
+              <w:top w:color="000000" w:space="0" w:sz="4" w:val="single"/>
+              <w:left w:color="000000" w:space="0" w:sz="4" w:val="single"/>
+              <w:bottom w:color="000000" w:space="0" w:sz="4" w:val="single"/>
+              <w:right w:color="000000" w:space="0" w:sz="4" w:val="single"/>
+            </w:tcBorders>
+            <w:shd w:fill="ffffff" w:val="clear"/>
+            <w:tcMar>
+              <w:top w:w="60.0" w:type="dxa"/>
+              <w:left w:w="100.0" w:type="dxa"/>
+              <w:bottom w:w="60.0" w:type="dxa"/>
+              <w:right w:w="100.0" w:type="dxa"/>
+            </w:tcMar>
+            <w:vAlign w:val="center"/>
+          </w:tcPr>
+          <w:p>
+            <w:pPr>
+              <w:spacing w:after="0" w:line="240" w:lineRule="auto"/>
+              <w:ind w:right="2785.275590551182"/>
+              <w:rPr>
+                <w:rFonts w:ascii="Arial" w:cs="Arial" w:eastAsia="Arial" w:hAnsi="Arial"/>
+                <w:sz w:val="22"/>
+                <w:szCs w:val="22"/>
+              </w:rPr>
+            </w:pPr>
+            <w:r>
+              <w:rPr>
+                <w:rFonts w:ascii="Arial" w:cs="Arial" w:eastAsia="Arial" w:hAnsi="Arial"/>
+                <w:sz w:val="22"/>
+                <w:szCs w:val="22"/>
+                <w:rtl w:val="0"/>
+              </w:rPr>
+              <w:t xml:space="preserve">Переглянути розклад своєї групи, щоб знати, коли і де відбуваються заняття.</w:t>
+            </w:r>
+          </w:p>
+        </w:tc>
+      </w:tr>
+      <w:tr>
+        <w:trPr>
+          <w:cantSplit w:val="0"/>
+          <w:tblHeader w:val="0"/>
+        </w:trPr>
+        <w:tc>
+          <w:tcPr>
+            <w:vMerge w:val="continue"/>
+            <w:tcBorders>
+              <w:top w:color="000000" w:space="0" w:sz="4" w:val="single"/>
+              <w:left w:color="000000" w:space="0" w:sz="4" w:val="single"/>
+              <w:bottom w:color="000000" w:space="0" w:sz="4" w:val="single"/>
+              <w:right w:color="000000" w:space="0" w:sz="4" w:val="single"/>
+            </w:tcBorders>
+            <w:shd w:fill="ffffff" w:val="clear"/>
+            <w:tcMar>
+              <w:top w:w="60.0" w:type="dxa"/>
+              <w:left w:w="100.0" w:type="dxa"/>
+              <w:bottom w:w="60.0" w:type="dxa"/>
+              <w:right w:w="100.0" w:type="dxa"/>
+            </w:tcMar>
+            <w:vAlign w:val="center"/>
+          </w:tcPr>
+          <w:p>
+            <w:pPr>
+              <w:widowControl w:val="0"/>
+              <w:spacing w:after="0" w:line="276" w:lineRule="auto"/>
+              <w:rPr>
+                <w:rFonts w:ascii="Arial" w:cs="Arial" w:eastAsia="Arial" w:hAnsi="Arial"/>
+                <w:sz w:val="22"/>
+                <w:szCs w:val="22"/>
+              </w:rPr>
+            </w:pPr>
+            <w:r>
+              <w:rPr>
+                <w:rtl w:val="0"/>
+              </w:rPr>
+            </w:r>
+          </w:p>
+        </w:tc>
+        <w:tc>
+          <w:tcPr>
+            <w:tcBorders>
+              <w:top w:color="000000" w:space="0" w:sz="4" w:val="single"/>
+              <w:left w:color="000000" w:space="0" w:sz="4" w:val="single"/>
+              <w:bottom w:color="000000" w:space="0" w:sz="4" w:val="single"/>
+              <w:right w:color="000000" w:space="0" w:sz="4" w:val="single"/>
+            </w:tcBorders>
+            <w:shd w:fill="ffffff" w:val="clear"/>
+            <w:tcMar>
+              <w:top w:w="60.0" w:type="dxa"/>
+              <w:left w:w="100.0" w:type="dxa"/>
+              <w:bottom w:w="60.0" w:type="dxa"/>
+              <w:right w:w="100.0" w:type="dxa"/>
+            </w:tcMar>
+            <w:vAlign w:val="center"/>
+          </w:tcPr>
+          <w:p>
+            <w:pPr>
+              <w:spacing w:after="0" w:line="240" w:lineRule="auto"/>
+              <w:rPr>
+                <w:rFonts w:ascii="Arial" w:cs="Arial" w:eastAsia="Arial" w:hAnsi="Arial"/>
+                <w:sz w:val="22"/>
+                <w:szCs w:val="22"/>
+              </w:rPr>
+            </w:pPr>
+            <w:r>
+              <w:rPr>
+                <w:rFonts w:ascii="Arial" w:cs="Arial" w:eastAsia="Arial" w:hAnsi="Arial"/>
+                <w:sz w:val="22"/>
+                <w:szCs w:val="22"/>
+                <w:rtl w:val="0"/>
+              </w:rPr>
+              <w:t xml:space="preserve">Створити завдання на особистій дошці, щоб відстежувати свій прогрес у виконанні завдань.</w:t>
+            </w:r>
+          </w:p>
+        </w:tc>
+      </w:tr>
+      <w:tr>
+        <w:trPr>
+          <w:cantSplit w:val="0"/>
+          <w:tblHeader w:val="0"/>
+        </w:trPr>
+        <w:tc>
+          <w:tcPr>
+            <w:vMerge w:val="continue"/>
+            <w:tcBorders>
+              <w:top w:color="000000" w:space="0" w:sz="4" w:val="single"/>
+              <w:left w:color="000000" w:space="0" w:sz="4" w:val="single"/>
+              <w:bottom w:color="000000" w:space="0" w:sz="4" w:val="single"/>
+              <w:right w:color="000000" w:space="0" w:sz="4" w:val="single"/>
+            </w:tcBorders>
+            <w:shd w:fill="ffffff" w:val="clear"/>
+            <w:tcMar>
+              <w:top w:w="60.0" w:type="dxa"/>
+              <w:left w:w="100.0" w:type="dxa"/>
+              <w:bottom w:w="60.0" w:type="dxa"/>
+              <w:right w:w="100.0" w:type="dxa"/>
+            </w:tcMar>
+            <w:vAlign w:val="center"/>
+          </w:tcPr>
+          <w:p>
+            <w:pPr>
+              <w:widowControl w:val="0"/>
+              <w:spacing w:after="0" w:line="276" w:lineRule="auto"/>
+              <w:rPr>
+                <w:rFonts w:ascii="Arial" w:cs="Arial" w:eastAsia="Arial" w:hAnsi="Arial"/>
+                <w:sz w:val="22"/>
+                <w:szCs w:val="22"/>
+              </w:rPr>
+            </w:pPr>
+            <w:r>
+              <w:rPr>
+                <w:rtl w:val="0"/>
+              </w:rPr>
+            </w:r>
+          </w:p>
+        </w:tc>
+        <w:tc>
+          <w:tcPr>
+            <w:tcBorders>
+              <w:top w:color="000000" w:space="0" w:sz="4" w:val="single"/>
+              <w:left w:color="000000" w:space="0" w:sz="4" w:val="single"/>
+              <w:bottom w:color="000000" w:space="0" w:sz="4" w:val="single"/>
+              <w:right w:color="000000" w:space="0" w:sz="4" w:val="single"/>
+            </w:tcBorders>
+            <w:shd w:fill="ffffff" w:val="clear"/>
+            <w:tcMar>
+              <w:top w:w="60.0" w:type="dxa"/>
+              <w:left w:w="100.0" w:type="dxa"/>
+              <w:bottom w:w="60.0" w:type="dxa"/>
+              <w:right w:w="100.0" w:type="dxa"/>
+            </w:tcMar>
+            <w:vAlign w:val="center"/>
+          </w:tcPr>
+          <w:p>
+            <w:pPr>
+              <w:spacing w:after="0" w:line="240" w:lineRule="auto"/>
+              <w:rPr>
+                <w:rFonts w:ascii="Arial" w:cs="Arial" w:eastAsia="Arial" w:hAnsi="Arial"/>
+                <w:sz w:val="22"/>
+                <w:szCs w:val="22"/>
+              </w:rPr>
+            </w:pPr>
+            <w:r>
+              <w:rPr>
+                <w:rFonts w:ascii="Arial" w:cs="Arial" w:eastAsia="Arial" w:hAnsi="Arial"/>
+                <w:sz w:val="22"/>
+                <w:szCs w:val="22"/>
+                <w:rtl w:val="0"/>
+              </w:rPr>
+              <w:t xml:space="preserve">Видалити завдання з особистої дошки, щоб прибрати неактуальні.</w:t>
+            </w:r>
+          </w:p>
+        </w:tc>
+      </w:tr>
+      <w:tr>
+        <w:trPr>
+          <w:cantSplit w:val="0"/>
+          <w:tblHeader w:val="0"/>
+        </w:trPr>
+        <w:tc>
+          <w:tcPr>
+            <w:vMerge w:val="continue"/>
+            <w:tcBorders>
+              <w:top w:color="000000" w:space="0" w:sz="4" w:val="single"/>
+              <w:left w:color="000000" w:space="0" w:sz="4" w:val="single"/>
+              <w:bottom w:color="000000" w:space="0" w:sz="4" w:val="single"/>
+              <w:right w:color="000000" w:space="0" w:sz="4" w:val="single"/>
+            </w:tcBorders>
+            <w:shd w:fill="ffffff" w:val="clear"/>
+            <w:tcMar>
+              <w:top w:w="60.0" w:type="dxa"/>
+              <w:left w:w="100.0" w:type="dxa"/>
+              <w:bottom w:w="60.0" w:type="dxa"/>
+              <w:right w:w="100.0" w:type="dxa"/>
+            </w:tcMar>
+            <w:vAlign w:val="center"/>
+          </w:tcPr>
+          <w:p>
+            <w:pPr>
+              <w:widowControl w:val="0"/>
+              <w:spacing w:after="0" w:line="276" w:lineRule="auto"/>
+              <w:rPr>
+                <w:rFonts w:ascii="Arial" w:cs="Arial" w:eastAsia="Arial" w:hAnsi="Arial"/>
+                <w:sz w:val="22"/>
+                <w:szCs w:val="22"/>
+              </w:rPr>
+            </w:pPr>
+            <w:r>
+              <w:rPr>
+                <w:rtl w:val="0"/>
+              </w:rPr>
+            </w:r>
+          </w:p>
+        </w:tc>
+        <w:tc>
+          <w:tcPr>
+            <w:tcBorders>
+              <w:top w:color="000000" w:space="0" w:sz="4" w:val="single"/>
+              <w:left w:color="000000" w:space="0" w:sz="4" w:val="single"/>
+              <w:bottom w:color="000000" w:space="0" w:sz="4" w:val="single"/>
+              <w:right w:color="000000" w:space="0" w:sz="4" w:val="single"/>
+            </w:tcBorders>
+            <w:shd w:fill="ffffff" w:val="clear"/>
+            <w:tcMar>
+              <w:top w:w="60.0" w:type="dxa"/>
+              <w:left w:w="100.0" w:type="dxa"/>
+              <w:bottom w:w="60.0" w:type="dxa"/>
+              <w:right w:w="100.0" w:type="dxa"/>
+            </w:tcMar>
+            <w:vAlign w:val="center"/>
+          </w:tcPr>
+          <w:p>
+            <w:pPr>
+              <w:spacing w:after="0" w:line="240" w:lineRule="auto"/>
+              <w:rPr>
+                <w:rFonts w:ascii="Arial" w:cs="Arial" w:eastAsia="Arial" w:hAnsi="Arial"/>
+                <w:sz w:val="22"/>
+                <w:szCs w:val="22"/>
+              </w:rPr>
+            </w:pPr>
+            <w:r>
+              <w:rPr>
+                <w:rFonts w:ascii="Arial" w:cs="Arial" w:eastAsia="Arial" w:hAnsi="Arial"/>
+                <w:sz w:val="22"/>
+                <w:szCs w:val="22"/>
+                <w:rtl w:val="0"/>
+              </w:rPr>
+              <w:t xml:space="preserve">Встановити дедлайн для завдання, щоб не пропустити термін його виконання.</w:t>
+            </w:r>
+          </w:p>
+        </w:tc>
+      </w:tr>
+      <w:tr>
+        <w:trPr>
+          <w:cantSplit w:val="0"/>
+          <w:tblHeader w:val="0"/>
+        </w:trPr>
+        <w:tc>
+          <w:tcPr>
+            <w:vMerge w:val="continue"/>
+            <w:tcBorders>
+              <w:top w:color="000000" w:space="0" w:sz="4" w:val="single"/>
+              <w:left w:color="000000" w:space="0" w:sz="4" w:val="single"/>
+              <w:bottom w:color="000000" w:space="0" w:sz="4" w:val="single"/>
+              <w:right w:color="000000" w:space="0" w:sz="4" w:val="single"/>
+            </w:tcBorders>
+            <w:shd w:fill="ffffff" w:val="clear"/>
+            <w:tcMar>
+              <w:top w:w="60.0" w:type="dxa"/>
+              <w:left w:w="100.0" w:type="dxa"/>
+              <w:bottom w:w="60.0" w:type="dxa"/>
+              <w:right w:w="100.0" w:type="dxa"/>
+            </w:tcMar>
+            <w:vAlign w:val="center"/>
+          </w:tcPr>
+          <w:p>
+            <w:pPr>
+              <w:widowControl w:val="0"/>
+              <w:spacing w:after="0" w:line="276" w:lineRule="auto"/>
+              <w:rPr>
+                <w:rFonts w:ascii="Arial" w:cs="Arial" w:eastAsia="Arial" w:hAnsi="Arial"/>
+                <w:sz w:val="22"/>
+                <w:szCs w:val="22"/>
+              </w:rPr>
+            </w:pPr>
+            <w:r>
+              <w:rPr>
+                <w:rtl w:val="0"/>
+              </w:rPr>
+            </w:r>
+          </w:p>
+        </w:tc>
+        <w:tc>
+          <w:tcPr>
+            <w:tcBorders>
+              <w:top w:color="000000" w:space="0" w:sz="4" w:val="single"/>
+              <w:left w:color="000000" w:space="0" w:sz="4" w:val="single"/>
+              <w:bottom w:color="000000" w:space="0" w:sz="4" w:val="single"/>
+              <w:right w:color="000000" w:space="0" w:sz="4" w:val="single"/>
+            </w:tcBorders>
+            <w:shd w:fill="ffffff" w:val="clear"/>
+            <w:tcMar>
+              <w:top w:w="60.0" w:type="dxa"/>
+              <w:left w:w="100.0" w:type="dxa"/>
+              <w:bottom w:w="60.0" w:type="dxa"/>
+              <w:right w:w="100.0" w:type="dxa"/>
+            </w:tcMar>
+            <w:vAlign w:val="center"/>
+          </w:tcPr>
+          <w:p>
+            <w:pPr>
+              <w:spacing w:after="0" w:line="240" w:lineRule="auto"/>
+              <w:rPr>
+                <w:rFonts w:ascii="Arial" w:cs="Arial" w:eastAsia="Arial" w:hAnsi="Arial"/>
+                <w:sz w:val="22"/>
+                <w:szCs w:val="22"/>
+              </w:rPr>
+            </w:pPr>
+            <w:r>
+              <w:rPr>
+                <w:rFonts w:ascii="Arial" w:cs="Arial" w:eastAsia="Arial" w:hAnsi="Arial"/>
+                <w:sz w:val="22"/>
+                <w:szCs w:val="22"/>
+                <w:rtl w:val="0"/>
+              </w:rPr>
+              <w:t xml:space="preserve">Оновити статус завдання на дошці, щоб відстежувати поточний прогрес.</w:t>
+            </w:r>
+          </w:p>
+        </w:tc>
+      </w:tr>
+      <w:tr>
+        <w:trPr>
+          <w:cantSplit w:val="0"/>
+          <w:tblHeader w:val="0"/>
+        </w:trPr>
+        <w:tc>
+          <w:tcPr>
+            <w:vMerge w:val="continue"/>
+            <w:tcBorders>
+              <w:top w:color="000000" w:space="0" w:sz="4" w:val="single"/>
+              <w:left w:color="000000" w:space="0" w:sz="4" w:val="single"/>
+              <w:bottom w:color="000000" w:space="0" w:sz="4" w:val="single"/>
+              <w:right w:color="000000" w:space="0" w:sz="4" w:val="single"/>
+            </w:tcBorders>
+            <w:shd w:fill="ffffff" w:val="clear"/>
+            <w:tcMar>
+              <w:top w:w="60.0" w:type="dxa"/>
+              <w:left w:w="100.0" w:type="dxa"/>
+              <w:bottom w:w="60.0" w:type="dxa"/>
+              <w:right w:w="100.0" w:type="dxa"/>
+            </w:tcMar>
+            <w:vAlign w:val="center"/>
+          </w:tcPr>
+          <w:p>
+            <w:pPr>
+              <w:widowControl w:val="0"/>
+              <w:spacing w:after="0" w:line="276" w:lineRule="auto"/>
+              <w:rPr>
+                <w:rFonts w:ascii="Arial" w:cs="Arial" w:eastAsia="Arial" w:hAnsi="Arial"/>
+                <w:sz w:val="22"/>
+                <w:szCs w:val="22"/>
+              </w:rPr>
+            </w:pPr>
+            <w:r>
+              <w:rPr>
+                <w:rtl w:val="0"/>
+              </w:rPr>
+            </w:r>
+          </w:p>
+        </w:tc>
+        <w:tc>
+          <w:tcPr>
+            <w:tcBorders>
+              <w:top w:color="000000" w:space="0" w:sz="4" w:val="single"/>
+              <w:left w:color="000000" w:space="0" w:sz="4" w:val="single"/>
+              <w:bottom w:color="000000" w:space="0" w:sz="4" w:val="single"/>
+              <w:right w:color="000000" w:space="0" w:sz="4" w:val="single"/>
+            </w:tcBorders>
+            <w:shd w:fill="ffffff" w:val="clear"/>
+            <w:tcMar>
+              <w:top w:w="60.0" w:type="dxa"/>
+              <w:left w:w="100.0" w:type="dxa"/>
+              <w:bottom w:w="60.0" w:type="dxa"/>
+              <w:right w:w="100.0" w:type="dxa"/>
+            </w:tcMar>
+            <w:vAlign w:val="center"/>
+          </w:tcPr>
+          <w:p>
+            <w:pPr>
+              <w:spacing w:after="0" w:line="240" w:lineRule="auto"/>
+              <w:rPr>
+                <w:rFonts w:ascii="Arial" w:cs="Arial" w:eastAsia="Arial" w:hAnsi="Arial"/>
+                <w:sz w:val="22"/>
+                <w:szCs w:val="22"/>
+              </w:rPr>
+            </w:pPr>
+            <w:r>
+              <w:rPr>
+                <w:rFonts w:ascii="Arial" w:cs="Arial" w:eastAsia="Arial" w:hAnsi="Arial"/>
+                <w:sz w:val="22"/>
+                <w:szCs w:val="22"/>
+                <w:rtl w:val="0"/>
+              </w:rPr>
+              <w:t xml:space="preserve">Додавати файли у власне хмарне сховище, щоб мати постійний доступ до навчальних матеріалів.</w:t>
+            </w:r>
+          </w:p>
+        </w:tc>
+      </w:tr>
+      <w:tr>
+        <w:trPr>
+          <w:cantSplit w:val="0"/>
+          <w:tblHeader w:val="0"/>
+        </w:trPr>
+        <w:tc>
+          <w:tcPr>
+            <w:vMerge w:val="continue"/>
+            <w:tcBorders>
+              <w:top w:color="000000" w:space="0" w:sz="4" w:val="single"/>
+              <w:left w:color="000000" w:space="0" w:sz="4" w:val="single"/>
+              <w:bottom w:color="000000" w:space="0" w:sz="4" w:val="single"/>
+              <w:right w:color="000000" w:space="0" w:sz="4" w:val="single"/>
+            </w:tcBorders>
+            <w:shd w:fill="ffffff" w:val="clear"/>
+            <w:tcMar>
+              <w:top w:w="60.0" w:type="dxa"/>
+              <w:left w:w="100.0" w:type="dxa"/>
+              <w:bottom w:w="60.0" w:type="dxa"/>
+              <w:right w:w="100.0" w:type="dxa"/>
+            </w:tcMar>
+            <w:vAlign w:val="center"/>
+          </w:tcPr>
+          <w:p>
+            <w:pPr>
+              <w:widowControl w:val="0"/>
+              <w:spacing w:after="0" w:line="276" w:lineRule="auto"/>
+              <w:rPr>
+                <w:rFonts w:ascii="Arial" w:cs="Arial" w:eastAsia="Arial" w:hAnsi="Arial"/>
+                <w:sz w:val="22"/>
+                <w:szCs w:val="22"/>
+              </w:rPr>
+            </w:pPr>
+            <w:r>
+              <w:rPr>
+                <w:rtl w:val="0"/>
+              </w:rPr>
+            </w:r>
+          </w:p>
+        </w:tc>
+        <w:tc>
+          <w:tcPr>
+            <w:tcBorders>
+              <w:top w:color="000000" w:space="0" w:sz="4" w:val="single"/>
+              <w:left w:color="000000" w:space="0" w:sz="4" w:val="single"/>
+              <w:bottom w:color="000000" w:space="0" w:sz="4" w:val="single"/>
+              <w:right w:color="000000" w:space="0" w:sz="4" w:val="single"/>
+            </w:tcBorders>
+            <w:shd w:fill="ffffff" w:val="clear"/>
+            <w:tcMar>
+              <w:top w:w="60.0" w:type="dxa"/>
+              <w:left w:w="100.0" w:type="dxa"/>
+              <w:bottom w:w="60.0" w:type="dxa"/>
+              <w:right w:w="100.0" w:type="dxa"/>
+            </w:tcMar>
+            <w:vAlign w:val="center"/>
+          </w:tcPr>
+          <w:p>
+            <w:pPr>
+              <w:spacing w:after="0" w:line="240" w:lineRule="auto"/>
+              <w:rPr>
+                <w:rFonts w:ascii="Arial" w:cs="Arial" w:eastAsia="Arial" w:hAnsi="Arial"/>
+                <w:sz w:val="22"/>
+                <w:szCs w:val="22"/>
+              </w:rPr>
+            </w:pPr>
+            <w:r>
+              <w:rPr>
+                <w:rFonts w:ascii="Arial" w:cs="Arial" w:eastAsia="Arial" w:hAnsi="Arial"/>
+                <w:sz w:val="22"/>
+                <w:szCs w:val="22"/>
+                <w:rtl w:val="0"/>
+              </w:rPr>
+              <w:t xml:space="preserve">Переглядати файли у сховищі, щоб швидко знайти потрібний навчальний матеріал.</w:t>
+            </w:r>
+          </w:p>
+        </w:tc>
+      </w:tr>
+      <w:tr>
+        <w:trPr>
+          <w:cantSplit w:val="0"/>
+          <w:tblHeader w:val="0"/>
+        </w:trPr>
+        <w:tc>
+          <w:tcPr>
+            <w:vMerge w:val="continue"/>
+            <w:tcBorders>
+              <w:top w:color="000000" w:space="0" w:sz="4" w:val="single"/>
+              <w:left w:color="000000" w:space="0" w:sz="4" w:val="single"/>
+              <w:bottom w:color="000000" w:space="0" w:sz="4" w:val="single"/>
+              <w:right w:color="000000" w:space="0" w:sz="4" w:val="single"/>
+            </w:tcBorders>
+            <w:shd w:fill="ffffff" w:val="clear"/>
+            <w:tcMar>
+              <w:top w:w="60.0" w:type="dxa"/>
+              <w:left w:w="100.0" w:type="dxa"/>
+              <w:bottom w:w="60.0" w:type="dxa"/>
+              <w:right w:w="100.0" w:type="dxa"/>
+            </w:tcMar>
+            <w:vAlign w:val="center"/>
+          </w:tcPr>
+          <w:p>
+            <w:pPr>
+              <w:widowControl w:val="0"/>
+              <w:spacing w:after="0" w:line="276" w:lineRule="auto"/>
+              <w:rPr>
+                <w:rFonts w:ascii="Arial" w:cs="Arial" w:eastAsia="Arial" w:hAnsi="Arial"/>
+                <w:sz w:val="22"/>
+                <w:szCs w:val="22"/>
+              </w:rPr>
+            </w:pPr>
+            <w:r>
+              <w:rPr>
+                <w:rtl w:val="0"/>
+              </w:rPr>
+            </w:r>
+          </w:p>
+        </w:tc>
+        <w:tc>
+          <w:tcPr>
+            <w:tcBorders>
+              <w:top w:color="000000" w:space="0" w:sz="4" w:val="single"/>
+              <w:left w:color="000000" w:space="0" w:sz="4" w:val="single"/>
+              <w:bottom w:color="000000" w:space="0" w:sz="4" w:val="single"/>
+              <w:right w:color="000000" w:space="0" w:sz="4" w:val="single"/>
+            </w:tcBorders>
+            <w:shd w:fill="ffffff" w:val="clear"/>
+            <w:tcMar>
+              <w:top w:w="60.0" w:type="dxa"/>
+              <w:left w:w="100.0" w:type="dxa"/>
+              <w:bottom w:w="60.0" w:type="dxa"/>
+              <w:right w:w="100.0" w:type="dxa"/>
+            </w:tcMar>
+            <w:vAlign w:val="center"/>
+          </w:tcPr>
+          <w:p>
+            <w:pPr>
+              <w:spacing w:after="0" w:line="240" w:lineRule="auto"/>
+              <w:rPr>
+                <w:rFonts w:ascii="Arial" w:cs="Arial" w:eastAsia="Arial" w:hAnsi="Arial"/>
+                <w:sz w:val="22"/>
+                <w:szCs w:val="22"/>
+              </w:rPr>
+            </w:pPr>
+            <w:r>
+              <w:rPr>
+                <w:rFonts w:ascii="Arial" w:cs="Arial" w:eastAsia="Arial" w:hAnsi="Arial"/>
+                <w:sz w:val="22"/>
+                <w:szCs w:val="22"/>
+                <w:rtl w:val="0"/>
+              </w:rPr>
+              <w:t xml:space="preserve">Видаляти файли зі свого сховища, щоб підтримувати порядок серед збережених матеріалів.</w:t>
+            </w:r>
+          </w:p>
+        </w:tc>
+      </w:tr>
+      <w:tr>
+        <w:trPr>
+          <w:cantSplit w:val="0"/>
+          <w:tblHeader w:val="0"/>
+        </w:trPr>
+        <w:tc>
+          <w:tcPr>
+            <w:vMerge w:val="continue"/>
+            <w:tcBorders>
+              <w:top w:color="000000" w:space="0" w:sz="4" w:val="single"/>
+              <w:left w:color="000000" w:space="0" w:sz="4" w:val="single"/>
+              <w:bottom w:color="000000" w:space="0" w:sz="4" w:val="single"/>
+              <w:right w:color="000000" w:space="0" w:sz="4" w:val="single"/>
+            </w:tcBorders>
+            <w:shd w:fill="ffffff" w:val="clear"/>
+            <w:tcMar>
+              <w:top w:w="60.0" w:type="dxa"/>
+              <w:left w:w="100.0" w:type="dxa"/>
+              <w:bottom w:w="60.0" w:type="dxa"/>
+              <w:right w:w="100.0" w:type="dxa"/>
+            </w:tcMar>
+            <w:vAlign w:val="center"/>
+          </w:tcPr>
+          <w:p>
+            <w:pPr>
+              <w:widowControl w:val="0"/>
+              <w:spacing w:after="0" w:line="276" w:lineRule="auto"/>
+              <w:rPr>
+                <w:rFonts w:ascii="Arial" w:cs="Arial" w:eastAsia="Arial" w:hAnsi="Arial"/>
+                <w:sz w:val="22"/>
+                <w:szCs w:val="22"/>
+              </w:rPr>
+            </w:pPr>
+            <w:r>
+              <w:rPr>
+                <w:rtl w:val="0"/>
+              </w:rPr>
+            </w:r>
+          </w:p>
+        </w:tc>
+        <w:tc>
+          <w:tcPr>
+            <w:tcBorders>
+              <w:top w:color="000000" w:space="0" w:sz="4" w:val="single"/>
+              <w:left w:color="000000" w:space="0" w:sz="4" w:val="single"/>
+              <w:bottom w:color="000000" w:space="0" w:sz="4" w:val="single"/>
+              <w:right w:color="000000" w:space="0" w:sz="4" w:val="single"/>
+            </w:tcBorders>
+            <w:shd w:fill="ffffff" w:val="clear"/>
+            <w:tcMar>
+              <w:top w:w="60.0" w:type="dxa"/>
+              <w:left w:w="100.0" w:type="dxa"/>
+              <w:bottom w:w="60.0" w:type="dxa"/>
+              <w:right w:w="100.0" w:type="dxa"/>
+            </w:tcMar>
+            <w:vAlign w:val="center"/>
+          </w:tcPr>
+          <w:p>
+            <w:pPr>
+              <w:spacing w:after="0" w:line="240" w:lineRule="auto"/>
+              <w:rPr>
+                <w:rFonts w:ascii="Arial" w:cs="Arial" w:eastAsia="Arial" w:hAnsi="Arial"/>
+                <w:sz w:val="22"/>
+                <w:szCs w:val="22"/>
+              </w:rPr>
+            </w:pPr>
+            <w:r>
+              <w:rPr>
+                <w:rFonts w:ascii="Arial" w:cs="Arial" w:eastAsia="Arial" w:hAnsi="Arial"/>
+                <w:sz w:val="22"/>
+                <w:szCs w:val="22"/>
+                <w:rtl w:val="0"/>
+              </w:rPr>
+              <w:t xml:space="preserve">Увімкнути email-сповіщення, щоб отримувати нагадування про наближення дедлайнів.</w:t>
+            </w:r>
+          </w:p>
+        </w:tc>
+      </w:tr>
+      <w:tr>
+        <w:trPr>
+          <w:cantSplit w:val="0"/>
+          <w:tblHeader w:val="0"/>
+        </w:trPr>
+        <w:tc>
+          <w:tcPr>
+            <w:vMerge w:val="continue"/>
+            <w:tcBorders>
+              <w:top w:color="000000" w:space="0" w:sz="4" w:val="single"/>
+              <w:left w:color="000000" w:space="0" w:sz="4" w:val="single"/>
+              <w:bottom w:color="000000" w:space="0" w:sz="4" w:val="single"/>
+              <w:right w:color="000000" w:space="0" w:sz="4" w:val="single"/>
+            </w:tcBorders>
+            <w:shd w:fill="ffffff" w:val="clear"/>
+            <w:tcMar>
+              <w:top w:w="60.0" w:type="dxa"/>
+              <w:left w:w="100.0" w:type="dxa"/>
+              <w:bottom w:w="60.0" w:type="dxa"/>
+              <w:right w:w="100.0" w:type="dxa"/>
+            </w:tcMar>
+            <w:vAlign w:val="center"/>
+          </w:tcPr>
+          <w:p>
+            <w:pPr>
+              <w:widowControl w:val="0"/>
+              <w:spacing w:after="0" w:line="276" w:lineRule="auto"/>
+              <w:rPr>
+                <w:rFonts w:ascii="Arial" w:cs="Arial" w:eastAsia="Arial" w:hAnsi="Arial"/>
+                <w:sz w:val="22"/>
+                <w:szCs w:val="22"/>
+              </w:rPr>
+            </w:pPr>
+            <w:r>
+              <w:rPr>
+                <w:rtl w:val="0"/>
+              </w:rPr>
+            </w:r>
+          </w:p>
+        </w:tc>
+        <w:tc>
+          <w:tcPr>
+            <w:tcBorders>
+              <w:top w:color="000000" w:space="0" w:sz="4" w:val="single"/>
+              <w:left w:color="000000" w:space="0" w:sz="4" w:val="single"/>
+              <w:bottom w:color="000000" w:space="0" w:sz="4" w:val="single"/>
+              <w:right w:color="000000" w:space="0" w:sz="4" w:val="single"/>
+            </w:tcBorders>
+            <w:shd w:fill="ffffff" w:val="clear"/>
+            <w:tcMar>
+              <w:top w:w="60.0" w:type="dxa"/>
+              <w:left w:w="100.0" w:type="dxa"/>
+              <w:bottom w:w="60.0" w:type="dxa"/>
+              <w:right w:w="100.0" w:type="dxa"/>
+            </w:tcMar>
+            <w:vAlign w:val="center"/>
+          </w:tcPr>
+          <w:p>
+            <w:pPr>
+              <w:spacing w:after="0" w:line="240" w:lineRule="auto"/>
+              <w:rPr>
+                <w:rFonts w:ascii="Arial" w:cs="Arial" w:eastAsia="Arial" w:hAnsi="Arial"/>
+                <w:sz w:val="22"/>
+                <w:szCs w:val="22"/>
+              </w:rPr>
+            </w:pPr>
+            <w:r>
+              <w:rPr>
+                <w:rFonts w:ascii="Arial" w:cs="Arial" w:eastAsia="Arial" w:hAnsi="Arial"/>
+                <w:sz w:val="22"/>
+                <w:szCs w:val="22"/>
+                <w:rtl w:val="0"/>
+              </w:rPr>
+              <w:t xml:space="preserve">Змінити фотографію профілю, щоб персоналізувати свій обліковий запис.</w:t>
+            </w:r>
+          </w:p>
+        </w:tc>
+      </w:tr>
+      <w:tr>
+        <w:trPr>
+          <w:cantSplit w:val="0"/>
+          <w:tblHeader w:val="0"/>
+        </w:trPr>
+        <w:tc>
+          <w:tcPr>
+            <w:vMerge w:val="continue"/>
+            <w:tcBorders>
+              <w:top w:color="000000" w:space="0" w:sz="4" w:val="single"/>
+              <w:left w:color="000000" w:space="0" w:sz="4" w:val="single"/>
+              <w:bottom w:color="000000" w:space="0" w:sz="4" w:val="single"/>
+              <w:right w:color="000000" w:space="0" w:sz="4" w:val="single"/>
+            </w:tcBorders>
+            <w:shd w:fill="ffffff" w:val="clear"/>
+            <w:tcMar>
+              <w:top w:w="60.0" w:type="dxa"/>
+              <w:left w:w="100.0" w:type="dxa"/>
+              <w:bottom w:w="60.0" w:type="dxa"/>
+              <w:right w:w="100.0" w:type="dxa"/>
+            </w:tcMar>
+            <w:vAlign w:val="center"/>
+          </w:tcPr>
+          <w:p>
+            <w:pPr>
+              <w:widowControl w:val="0"/>
+              <w:spacing w:after="0" w:line="276" w:lineRule="auto"/>
+              <w:rPr>
+                <w:rFonts w:ascii="Arial" w:cs="Arial" w:eastAsia="Arial" w:hAnsi="Arial"/>
+                <w:sz w:val="22"/>
+                <w:szCs w:val="22"/>
+              </w:rPr>
+            </w:pPr>
+            <w:r>
+              <w:rPr>
+                <w:rtl w:val="0"/>
+              </w:rPr>
+            </w:r>
+          </w:p>
+        </w:tc>
+        <w:tc>
+          <w:tcPr>
+            <w:tcBorders>
+              <w:top w:color="000000" w:space="0" w:sz="4" w:val="single"/>
+              <w:left w:color="000000" w:space="0" w:sz="4" w:val="single"/>
+              <w:bottom w:color="000000" w:space="0" w:sz="4" w:val="single"/>
+              <w:right w:color="000000" w:space="0" w:sz="4" w:val="single"/>
+            </w:tcBorders>
+            <w:shd w:fill="ffffff" w:val="clear"/>
+            <w:tcMar>
+              <w:top w:w="60.0" w:type="dxa"/>
+              <w:left w:w="100.0" w:type="dxa"/>
+              <w:bottom w:w="60.0" w:type="dxa"/>
+              <w:right w:w="100.0" w:type="dxa"/>
+            </w:tcMar>
+            <w:vAlign w:val="center"/>
+          </w:tcPr>
+          <w:p>
+            <w:pPr>
+              <w:spacing w:after="0" w:line="240" w:lineRule="auto"/>
+              <w:rPr>
+                <w:rFonts w:ascii="Arial" w:cs="Arial" w:eastAsia="Arial" w:hAnsi="Arial"/>
+                <w:sz w:val="22"/>
+                <w:szCs w:val="22"/>
+              </w:rPr>
+            </w:pPr>
+            <w:r>
+              <w:rPr>
+                <w:rFonts w:ascii="Arial" w:cs="Arial" w:eastAsia="Arial" w:hAnsi="Arial"/>
+                <w:sz w:val="22"/>
+                <w:szCs w:val="22"/>
+                <w:rtl w:val="0"/>
+              </w:rPr>
+              <w:t xml:space="preserve">Надіслати запит до технічної підтримки із описом проблеми або відгуком, щоб отримати фідбек.</w:t>
+            </w:r>
+          </w:p>
+        </w:tc>
+      </w:tr>
+      <w:tr>
+        <w:trPr>
+          <w:cantSplit w:val="0"/>
+          <w:tblHeader w:val="0"/>
+        </w:trPr>
+        <w:tc>
+          <w:tcPr>
+            <w:vMerge w:val="restart"/>
+            <w:tcBorders>
+              <w:top w:color="000000" w:space="0" w:sz="4" w:val="single"/>
+              <w:left w:color="000000" w:space="0" w:sz="4" w:val="single"/>
+              <w:bottom w:color="000000" w:space="0" w:sz="4" w:val="single"/>
+              <w:right w:color="000000" w:space="0" w:sz="4" w:val="single"/>
+            </w:tcBorders>
+            <w:shd w:fill="ffffff" w:val="clear"/>
+            <w:tcMar>
+              <w:top w:w="60.0" w:type="dxa"/>
+              <w:left w:w="100.0" w:type="dxa"/>
+              <w:bottom w:w="60.0" w:type="dxa"/>
+              <w:right w:w="100.0" w:type="dxa"/>
+            </w:tcMar>
+            <w:vAlign w:val="center"/>
+          </w:tcPr>
+          <w:p>
+            <w:pPr>
+              <w:spacing w:after="0" w:line="240" w:lineRule="auto"/>
+              <w:jc w:val="center"/>
+              <w:rPr>
+                <w:rFonts w:ascii="Arial" w:cs="Arial" w:eastAsia="Arial" w:hAnsi="Arial"/>
+                <w:sz w:val="22"/>
+                <w:szCs w:val="22"/>
+              </w:rPr>
+            </w:pPr>
+            <w:r>
+              <w:rPr>
+                <w:rFonts w:ascii="Arial" w:cs="Arial" w:eastAsia="Arial" w:hAnsi="Arial"/>
+                <w:sz w:val="22"/>
+                <w:szCs w:val="22"/>
+                <w:rtl w:val="0"/>
+              </w:rPr>
+              <w:t xml:space="preserve">Староста</w:t>
+            </w:r>
+          </w:p>
+        </w:tc>
+        <w:tc>
+          <w:tcPr>
+            <w:tcBorders>
+              <w:top w:color="000000" w:space="0" w:sz="4" w:val="single"/>
+              <w:left w:color="000000" w:space="0" w:sz="4" w:val="single"/>
+              <w:bottom w:color="000000" w:space="0" w:sz="4" w:val="single"/>
+              <w:right w:color="000000" w:space="0" w:sz="4" w:val="single"/>
+            </w:tcBorders>
+            <w:shd w:fill="ffffff" w:val="clear"/>
+            <w:tcMar>
+              <w:top w:w="60.0" w:type="dxa"/>
+              <w:left w:w="100.0" w:type="dxa"/>
+              <w:bottom w:w="60.0" w:type="dxa"/>
+              <w:right w:w="100.0" w:type="dxa"/>
+            </w:tcMar>
+            <w:vAlign w:val="center"/>
+          </w:tcPr>
+          <w:p>
+            <w:pPr>
+              <w:spacing w:after="0" w:line="240" w:lineRule="auto"/>
+              <w:rPr>
+                <w:rFonts w:ascii="Arial" w:cs="Arial" w:eastAsia="Arial" w:hAnsi="Arial"/>
+                <w:sz w:val="22"/>
+                <w:szCs w:val="22"/>
+              </w:rPr>
+            </w:pPr>
+            <w:r>
+              <w:rPr>
+                <w:rFonts w:ascii="Arial" w:cs="Arial" w:eastAsia="Arial" w:hAnsi="Arial"/>
+                <w:sz w:val="22"/>
+                <w:szCs w:val="22"/>
+                <w:rtl w:val="0"/>
+              </w:rPr>
+              <w:t xml:space="preserve">Мати всі можливості студента, щоб повноцінно користуватись застосунком як учасник навчального процесу.</w:t>
+            </w:r>
+          </w:p>
+        </w:tc>
+      </w:tr>
+      <w:tr>
+        <w:trPr>
+          <w:cantSplit w:val="0"/>
+          <w:tblHeader w:val="0"/>
+        </w:trPr>
+        <w:tc>
+          <w:tcPr>
+            <w:vMerge w:val="continue"/>
+            <w:tcBorders>
+              <w:top w:color="000000" w:space="0" w:sz="4" w:val="single"/>
+              <w:left w:color="000000" w:space="0" w:sz="4" w:val="single"/>
+              <w:bottom w:color="000000" w:space="0" w:sz="4" w:val="single"/>
+              <w:right w:color="000000" w:space="0" w:sz="4" w:val="single"/>
+            </w:tcBorders>
+            <w:shd w:fill="ffffff" w:val="clear"/>
+            <w:tcMar>
+              <w:top w:w="60.0" w:type="dxa"/>
+              <w:left w:w="100.0" w:type="dxa"/>
+              <w:bottom w:w="60.0" w:type="dxa"/>
+              <w:right w:w="100.0" w:type="dxa"/>
+            </w:tcMar>
+            <w:vAlign w:val="center"/>
+          </w:tcPr>
+          <w:p>
+            <w:pPr>
+              <w:widowControl w:val="0"/>
+              <w:spacing w:after="0" w:line="276" w:lineRule="auto"/>
+              <w:rPr>
+                <w:rFonts w:ascii="Arial" w:cs="Arial" w:eastAsia="Arial" w:hAnsi="Arial"/>
+                <w:sz w:val="22"/>
+                <w:szCs w:val="22"/>
+              </w:rPr>
+            </w:pPr>
+            <w:r>
+              <w:rPr>
+                <w:rtl w:val="0"/>
+              </w:rPr>
+            </w:r>
+          </w:p>
+        </w:tc>
+        <w:tc>
+          <w:tcPr>
+            <w:tcBorders>
+              <w:top w:color="000000" w:space="0" w:sz="4" w:val="single"/>
+              <w:left w:color="000000" w:space="0" w:sz="4" w:val="single"/>
+              <w:bottom w:color="000000" w:space="0" w:sz="4" w:val="single"/>
+              <w:right w:color="000000" w:space="0" w:sz="4" w:val="single"/>
+            </w:tcBorders>
+            <w:shd w:fill="ffffff" w:val="clear"/>
+            <w:tcMar>
+              <w:top w:w="60.0" w:type="dxa"/>
+              <w:left w:w="100.0" w:type="dxa"/>
+              <w:bottom w:w="60.0" w:type="dxa"/>
+              <w:right w:w="100.0" w:type="dxa"/>
+            </w:tcMar>
+            <w:vAlign w:val="center"/>
+          </w:tcPr>
+          <w:p>
+            <w:pPr>
+              <w:spacing w:after="0" w:line="240" w:lineRule="auto"/>
+              <w:rPr>
+                <w:rFonts w:ascii="Arial" w:cs="Arial" w:eastAsia="Arial" w:hAnsi="Arial"/>
+                <w:sz w:val="22"/>
+                <w:szCs w:val="22"/>
+              </w:rPr>
+            </w:pPr>
+            <w:r>
+              <w:rPr>
+                <w:rFonts w:ascii="Arial" w:cs="Arial" w:eastAsia="Arial" w:hAnsi="Arial"/>
+                <w:sz w:val="22"/>
+                <w:szCs w:val="22"/>
+                <w:rtl w:val="0"/>
+              </w:rPr>
+              <w:t xml:space="preserve">Переглянути список учасників своєї групи, щоб знати, хто входить до складу групи.</w:t>
+            </w:r>
+          </w:p>
+        </w:tc>
+      </w:tr>
+      <w:tr>
+        <w:trPr>
+          <w:cantSplit w:val="0"/>
+          <w:tblHeader w:val="0"/>
+        </w:trPr>
+        <w:tc>
+          <w:tcPr>
+            <w:vMerge w:val="continue"/>
+            <w:tcBorders>
+              <w:top w:color="000000" w:space="0" w:sz="4" w:val="single"/>
+              <w:left w:color="000000" w:space="0" w:sz="4" w:val="single"/>
+              <w:bottom w:color="000000" w:space="0" w:sz="4" w:val="single"/>
+              <w:right w:color="000000" w:space="0" w:sz="4" w:val="single"/>
+            </w:tcBorders>
+            <w:shd w:fill="ffffff" w:val="clear"/>
+            <w:tcMar>
+              <w:top w:w="60.0" w:type="dxa"/>
+              <w:left w:w="100.0" w:type="dxa"/>
+              <w:bottom w:w="60.0" w:type="dxa"/>
+              <w:right w:w="100.0" w:type="dxa"/>
+            </w:tcMar>
+            <w:vAlign w:val="center"/>
+          </w:tcPr>
+          <w:p>
+            <w:pPr>
+              <w:widowControl w:val="0"/>
+              <w:spacing w:after="0" w:line="276" w:lineRule="auto"/>
+              <w:rPr>
+                <w:rFonts w:ascii="Arial" w:cs="Arial" w:eastAsia="Arial" w:hAnsi="Arial"/>
+                <w:sz w:val="22"/>
+                <w:szCs w:val="22"/>
+              </w:rPr>
+            </w:pPr>
+            <w:r>
+              <w:rPr>
+                <w:rtl w:val="0"/>
+              </w:rPr>
+            </w:r>
+          </w:p>
+        </w:tc>
+        <w:tc>
+          <w:tcPr>
+            <w:tcBorders>
+              <w:top w:color="000000" w:space="0" w:sz="4" w:val="single"/>
+              <w:left w:color="000000" w:space="0" w:sz="4" w:val="single"/>
+              <w:bottom w:color="000000" w:space="0" w:sz="4" w:val="single"/>
+              <w:right w:color="000000" w:space="0" w:sz="4" w:val="single"/>
+            </w:tcBorders>
+            <w:shd w:fill="ffffff" w:val="clear"/>
+            <w:tcMar>
+              <w:top w:w="60.0" w:type="dxa"/>
+              <w:left w:w="100.0" w:type="dxa"/>
+              <w:bottom w:w="60.0" w:type="dxa"/>
+              <w:right w:w="100.0" w:type="dxa"/>
+            </w:tcMar>
+            <w:vAlign w:val="center"/>
+          </w:tcPr>
+          <w:p>
+            <w:pPr>
+              <w:spacing w:after="0" w:line="240" w:lineRule="auto"/>
+              <w:rPr>
+                <w:rFonts w:ascii="Arial" w:cs="Arial" w:eastAsia="Arial" w:hAnsi="Arial"/>
+                <w:sz w:val="22"/>
+                <w:szCs w:val="22"/>
+              </w:rPr>
+            </w:pPr>
+            <w:r>
+              <w:rPr>
+                <w:rFonts w:ascii="Arial" w:cs="Arial" w:eastAsia="Arial" w:hAnsi="Arial"/>
+                <w:sz w:val="22"/>
+                <w:szCs w:val="22"/>
+                <w:rtl w:val="0"/>
+              </w:rPr>
+              <w:t xml:space="preserve">Додати або видалити студента зі своєї групи, щоб підтримувати актуальний склад групи.</w:t>
+            </w:r>
+          </w:p>
+        </w:tc>
+      </w:tr>
+      <w:tr>
+        <w:trPr>
+          <w:cantSplit w:val="0"/>
+          <w:tblHeader w:val="0"/>
+        </w:trPr>
+        <w:tc>
+          <w:tcPr>
+            <w:vMerge w:val="continue"/>
+            <w:tcBorders>
+              <w:top w:color="000000" w:space="0" w:sz="4" w:val="single"/>
+              <w:left w:color="000000" w:space="0" w:sz="4" w:val="single"/>
+              <w:bottom w:color="000000" w:space="0" w:sz="4" w:val="single"/>
+              <w:right w:color="000000" w:space="0" w:sz="4" w:val="single"/>
+            </w:tcBorders>
+            <w:shd w:fill="ffffff" w:val="clear"/>
+            <w:tcMar>
+              <w:top w:w="60.0" w:type="dxa"/>
+              <w:left w:w="100.0" w:type="dxa"/>
+              <w:bottom w:w="60.0" w:type="dxa"/>
+              <w:right w:w="100.0" w:type="dxa"/>
+            </w:tcMar>
+            <w:vAlign w:val="center"/>
+          </w:tcPr>
+          <w:p>
+            <w:pPr>
+              <w:widowControl w:val="0"/>
+              <w:spacing w:after="0" w:line="276" w:lineRule="auto"/>
+              <w:rPr>
+                <w:rFonts w:ascii="Arial" w:cs="Arial" w:eastAsia="Arial" w:hAnsi="Arial"/>
+                <w:sz w:val="22"/>
+                <w:szCs w:val="22"/>
+              </w:rPr>
+            </w:pPr>
+            <w:r>
+              <w:rPr>
+                <w:rtl w:val="0"/>
+              </w:rPr>
+            </w:r>
+          </w:p>
+        </w:tc>
+        <w:tc>
+          <w:tcPr>
+            <w:tcBorders>
+              <w:top w:color="000000" w:space="0" w:sz="4" w:val="single"/>
+              <w:left w:color="000000" w:space="0" w:sz="4" w:val="single"/>
+              <w:bottom w:color="000000" w:space="0" w:sz="4" w:val="single"/>
+              <w:right w:color="000000" w:space="0" w:sz="4" w:val="single"/>
+            </w:tcBorders>
+            <w:shd w:fill="ffffff" w:val="clear"/>
+            <w:tcMar>
+              <w:top w:w="60.0" w:type="dxa"/>
+              <w:left w:w="100.0" w:type="dxa"/>
+              <w:bottom w:w="60.0" w:type="dxa"/>
+              <w:right w:w="100.0" w:type="dxa"/>
+            </w:tcMar>
+            <w:vAlign w:val="center"/>
+          </w:tcPr>
+          <w:p>
+            <w:pPr>
+              <w:spacing w:after="0" w:line="240" w:lineRule="auto"/>
+              <w:rPr>
+                <w:rFonts w:ascii="Arial" w:cs="Arial" w:eastAsia="Arial" w:hAnsi="Arial"/>
+                <w:sz w:val="22"/>
+                <w:szCs w:val="22"/>
+              </w:rPr>
+            </w:pPr>
+            <w:r>
+              <w:rPr>
+                <w:rFonts w:ascii="Arial" w:cs="Arial" w:eastAsia="Arial" w:hAnsi="Arial"/>
+                <w:sz w:val="22"/>
+                <w:szCs w:val="22"/>
+                <w:rtl w:val="0"/>
+              </w:rPr>
+              <w:t xml:space="preserve">Надати студенту доступ до створення завдань на груповій дошці, щоб залучити його до спільної роботи.</w:t>
+            </w:r>
+          </w:p>
+        </w:tc>
+      </w:tr>
+      <w:tr>
+        <w:trPr>
+          <w:cantSplit w:val="0"/>
+          <w:tblHeader w:val="0"/>
+        </w:trPr>
+        <w:tc>
+          <w:tcPr>
+            <w:vMerge w:val="continue"/>
+            <w:tcBorders>
+              <w:top w:color="000000" w:space="0" w:sz="4" w:val="single"/>
+              <w:left w:color="000000" w:space="0" w:sz="4" w:val="single"/>
+              <w:bottom w:color="000000" w:space="0" w:sz="4" w:val="single"/>
+              <w:right w:color="000000" w:space="0" w:sz="4" w:val="single"/>
+            </w:tcBorders>
+            <w:shd w:fill="ffffff" w:val="clear"/>
+            <w:tcMar>
+              <w:top w:w="60.0" w:type="dxa"/>
+              <w:left w:w="100.0" w:type="dxa"/>
+              <w:bottom w:w="60.0" w:type="dxa"/>
+              <w:right w:w="100.0" w:type="dxa"/>
+            </w:tcMar>
+            <w:vAlign w:val="center"/>
+          </w:tcPr>
+          <w:p>
+            <w:pPr>
+              <w:widowControl w:val="0"/>
+              <w:spacing w:after="0" w:line="276" w:lineRule="auto"/>
+              <w:rPr>
+                <w:rFonts w:ascii="Arial" w:cs="Arial" w:eastAsia="Arial" w:hAnsi="Arial"/>
+                <w:sz w:val="22"/>
+                <w:szCs w:val="22"/>
+              </w:rPr>
+            </w:pPr>
+            <w:r>
+              <w:rPr>
+                <w:rtl w:val="0"/>
+              </w:rPr>
+            </w:r>
+          </w:p>
+        </w:tc>
+        <w:tc>
+          <w:tcPr>
+            <w:tcBorders>
+              <w:top w:color="000000" w:space="0" w:sz="4" w:val="single"/>
+              <w:left w:color="000000" w:space="0" w:sz="4" w:val="single"/>
+              <w:bottom w:color="000000" w:space="0" w:sz="4" w:val="single"/>
+              <w:right w:color="000000" w:space="0" w:sz="4" w:val="single"/>
+            </w:tcBorders>
+            <w:shd w:fill="ffffff" w:val="clear"/>
+            <w:tcMar>
+              <w:top w:w="60.0" w:type="dxa"/>
+              <w:left w:w="100.0" w:type="dxa"/>
+              <w:bottom w:w="60.0" w:type="dxa"/>
+              <w:right w:w="100.0" w:type="dxa"/>
+            </w:tcMar>
+            <w:vAlign w:val="center"/>
+          </w:tcPr>
+          <w:p>
+            <w:pPr>
+              <w:spacing w:after="0" w:line="240" w:lineRule="auto"/>
+              <w:rPr>
+                <w:rFonts w:ascii="Arial" w:cs="Arial" w:eastAsia="Arial" w:hAnsi="Arial"/>
+                <w:sz w:val="22"/>
+                <w:szCs w:val="22"/>
+              </w:rPr>
+            </w:pPr>
+            <w:r>
+              <w:rPr>
+                <w:rFonts w:ascii="Arial" w:cs="Arial" w:eastAsia="Arial" w:hAnsi="Arial"/>
+                <w:sz w:val="22"/>
+                <w:szCs w:val="22"/>
+                <w:rtl w:val="0"/>
+              </w:rPr>
+              <w:t xml:space="preserve">Створити завдання на груповій дошці, щоб організувати спільну роботу групи.</w:t>
+            </w:r>
+          </w:p>
+        </w:tc>
+      </w:tr>
+      <w:tr>
+        <w:trPr>
+          <w:cantSplit w:val="0"/>
+          <w:tblHeader w:val="0"/>
+        </w:trPr>
+        <w:tc>
+          <w:tcPr>
+            <w:vMerge w:val="continue"/>
+            <w:tcBorders>
+              <w:top w:color="000000" w:space="0" w:sz="4" w:val="single"/>
+              <w:left w:color="000000" w:space="0" w:sz="4" w:val="single"/>
+              <w:bottom w:color="000000" w:space="0" w:sz="4" w:val="single"/>
+              <w:right w:color="000000" w:space="0" w:sz="4" w:val="single"/>
+            </w:tcBorders>
+            <w:shd w:fill="ffffff" w:val="clear"/>
+            <w:tcMar>
+              <w:top w:w="60.0" w:type="dxa"/>
+              <w:left w:w="100.0" w:type="dxa"/>
+              <w:bottom w:w="60.0" w:type="dxa"/>
+              <w:right w:w="100.0" w:type="dxa"/>
+            </w:tcMar>
+            <w:vAlign w:val="center"/>
+          </w:tcPr>
+          <w:p>
+            <w:pPr>
+              <w:widowControl w:val="0"/>
+              <w:spacing w:after="0" w:line="276" w:lineRule="auto"/>
+              <w:rPr>
+                <w:rFonts w:ascii="Arial" w:cs="Arial" w:eastAsia="Arial" w:hAnsi="Arial"/>
+                <w:sz w:val="22"/>
+                <w:szCs w:val="22"/>
+              </w:rPr>
+            </w:pPr>
+            <w:r>
+              <w:rPr>
+                <w:rtl w:val="0"/>
+              </w:rPr>
+            </w:r>
+          </w:p>
+        </w:tc>
+        <w:tc>
+          <w:tcPr>
+            <w:tcBorders>
+              <w:top w:color="000000" w:space="0" w:sz="4" w:val="single"/>
+              <w:left w:color="000000" w:space="0" w:sz="4" w:val="single"/>
+              <w:bottom w:color="000000" w:space="0" w:sz="4" w:val="single"/>
+              <w:right w:color="000000" w:space="0" w:sz="4" w:val="single"/>
+            </w:tcBorders>
+            <w:shd w:fill="ffffff" w:val="clear"/>
+            <w:tcMar>
+              <w:top w:w="60.0" w:type="dxa"/>
+              <w:left w:w="100.0" w:type="dxa"/>
+              <w:bottom w:w="60.0" w:type="dxa"/>
+              <w:right w:w="100.0" w:type="dxa"/>
+            </w:tcMar>
+            <w:vAlign w:val="center"/>
+          </w:tcPr>
+          <w:p>
+            <w:pPr>
+              <w:spacing w:after="0" w:line="240" w:lineRule="auto"/>
+              <w:rPr>
+                <w:rFonts w:ascii="Arial" w:cs="Arial" w:eastAsia="Arial" w:hAnsi="Arial"/>
+                <w:sz w:val="22"/>
+                <w:szCs w:val="22"/>
+              </w:rPr>
+            </w:pPr>
+            <w:r>
+              <w:rPr>
+                <w:rFonts w:ascii="Arial" w:cs="Arial" w:eastAsia="Arial" w:hAnsi="Arial"/>
+                <w:sz w:val="22"/>
+                <w:szCs w:val="22"/>
+                <w:rtl w:val="0"/>
+              </w:rPr>
+              <w:t xml:space="preserve">Видаляти завдання з групової дошки, щоб прибирати виконані або неактуальні завдання.</w:t>
+            </w:r>
+          </w:p>
+        </w:tc>
+      </w:tr>
+      <w:tr>
+        <w:trPr>
+          <w:cantSplit w:val="0"/>
+          <w:tblHeader w:val="0"/>
+        </w:trPr>
+        <w:tc>
+          <w:tcPr>
+            <w:vMerge w:val="continue"/>
+            <w:tcBorders>
+              <w:top w:color="000000" w:space="0" w:sz="4" w:val="single"/>
+              <w:left w:color="000000" w:space="0" w:sz="4" w:val="single"/>
+              <w:bottom w:color="000000" w:space="0" w:sz="4" w:val="single"/>
+              <w:right w:color="000000" w:space="0" w:sz="4" w:val="single"/>
+            </w:tcBorders>
+            <w:shd w:fill="ffffff" w:val="clear"/>
+            <w:tcMar>
+              <w:top w:w="60.0" w:type="dxa"/>
+              <w:left w:w="100.0" w:type="dxa"/>
+              <w:bottom w:w="60.0" w:type="dxa"/>
+              <w:right w:w="100.0" w:type="dxa"/>
+            </w:tcMar>
+            <w:vAlign w:val="center"/>
+          </w:tcPr>
+          <w:p>
+            <w:pPr>
+              <w:widowControl w:val="0"/>
+              <w:spacing w:after="0" w:line="276" w:lineRule="auto"/>
+              <w:rPr>
+                <w:rFonts w:ascii="Arial" w:cs="Arial" w:eastAsia="Arial" w:hAnsi="Arial"/>
+                <w:sz w:val="22"/>
+                <w:szCs w:val="22"/>
+              </w:rPr>
+            </w:pPr>
+            <w:r>
+              <w:rPr>
+                <w:rtl w:val="0"/>
+              </w:rPr>
+            </w:r>
+          </w:p>
+        </w:tc>
+        <w:tc>
+          <w:tcPr>
+            <w:tcBorders>
+              <w:top w:color="000000" w:space="0" w:sz="4" w:val="single"/>
+              <w:left w:color="000000" w:space="0" w:sz="4" w:val="single"/>
+              <w:bottom w:color="000000" w:space="0" w:sz="4" w:val="single"/>
+              <w:right w:color="000000" w:space="0" w:sz="4" w:val="single"/>
+            </w:tcBorders>
+            <w:shd w:fill="ffffff" w:val="clear"/>
+            <w:tcMar>
+              <w:top w:w="60.0" w:type="dxa"/>
+              <w:left w:w="100.0" w:type="dxa"/>
+              <w:bottom w:w="60.0" w:type="dxa"/>
+              <w:right w:w="100.0" w:type="dxa"/>
+            </w:tcMar>
+            <w:vAlign w:val="center"/>
+          </w:tcPr>
+          <w:p>
+            <w:pPr>
+              <w:spacing w:after="0" w:line="240" w:lineRule="auto"/>
+              <w:rPr>
+                <w:rFonts w:ascii="Arial" w:cs="Arial" w:eastAsia="Arial" w:hAnsi="Arial"/>
+                <w:sz w:val="22"/>
+                <w:szCs w:val="22"/>
+              </w:rPr>
+            </w:pPr>
+            <w:r>
+              <w:rPr>
+                <w:rFonts w:ascii="Arial" w:cs="Arial" w:eastAsia="Arial" w:hAnsi="Arial"/>
+                <w:sz w:val="22"/>
+                <w:szCs w:val="22"/>
+                <w:rtl w:val="0"/>
+              </w:rPr>
+              <w:t xml:space="preserve">Переглянути та оновити розклад своєї групи, щоб учасники групи мали актуальний розклад занять.</w:t>
+            </w:r>
+          </w:p>
+        </w:tc>
+      </w:tr>
+      <w:tr>
+        <w:trPr>
+          <w:cantSplit w:val="0"/>
+          <w:tblHeader w:val="0"/>
+        </w:trPr>
+        <w:tc>
+          <w:tcPr>
+            <w:vMerge w:val="continue"/>
+            <w:tcBorders>
+              <w:top w:color="000000" w:space="0" w:sz="4" w:val="single"/>
+              <w:left w:color="000000" w:space="0" w:sz="4" w:val="single"/>
+              <w:bottom w:color="000000" w:space="0" w:sz="4" w:val="single"/>
+              <w:right w:color="000000" w:space="0" w:sz="4" w:val="single"/>
+            </w:tcBorders>
+            <w:shd w:fill="ffffff" w:val="clear"/>
+            <w:tcMar>
+              <w:top w:w="60.0" w:type="dxa"/>
+              <w:left w:w="100.0" w:type="dxa"/>
+              <w:bottom w:w="60.0" w:type="dxa"/>
+              <w:right w:w="100.0" w:type="dxa"/>
+            </w:tcMar>
+            <w:vAlign w:val="center"/>
+          </w:tcPr>
+          <w:p>
+            <w:pPr>
+              <w:widowControl w:val="0"/>
+              <w:spacing w:after="0" w:line="276" w:lineRule="auto"/>
+              <w:rPr>
+                <w:rFonts w:ascii="Arial" w:cs="Arial" w:eastAsia="Arial" w:hAnsi="Arial"/>
+                <w:sz w:val="22"/>
+                <w:szCs w:val="22"/>
+              </w:rPr>
+            </w:pPr>
+            <w:r>
+              <w:rPr>
+                <w:rtl w:val="0"/>
+              </w:rPr>
+            </w:r>
+          </w:p>
+        </w:tc>
+        <w:tc>
+          <w:tcPr>
+            <w:tcBorders>
+              <w:top w:color="000000" w:space="0" w:sz="4" w:val="single"/>
+              <w:left w:color="000000" w:space="0" w:sz="4" w:val="single"/>
+              <w:bottom w:color="000000" w:space="0" w:sz="4" w:val="single"/>
+              <w:right w:color="000000" w:space="0" w:sz="4" w:val="single"/>
+            </w:tcBorders>
+            <w:shd w:fill="ffffff" w:val="clear"/>
+            <w:tcMar>
+              <w:top w:w="60.0" w:type="dxa"/>
+              <w:left w:w="100.0" w:type="dxa"/>
+              <w:bottom w:w="60.0" w:type="dxa"/>
+              <w:right w:w="100.0" w:type="dxa"/>
+            </w:tcMar>
+            <w:vAlign w:val="center"/>
+          </w:tcPr>
+          <w:p>
+            <w:pPr>
+              <w:spacing w:after="0" w:line="240" w:lineRule="auto"/>
+              <w:rPr>
+                <w:rFonts w:ascii="Arial" w:cs="Arial" w:eastAsia="Arial" w:hAnsi="Arial"/>
+                <w:sz w:val="22"/>
+                <w:szCs w:val="22"/>
+              </w:rPr>
+            </w:pPr>
+            <w:r>
+              <w:rPr>
+                <w:rFonts w:ascii="Arial" w:cs="Arial" w:eastAsia="Arial" w:hAnsi="Arial"/>
+                <w:sz w:val="22"/>
+                <w:szCs w:val="22"/>
+                <w:rtl w:val="0"/>
+              </w:rPr>
+              <w:t xml:space="preserve">Додавати та видаляти файли у груповому сховищі, щоб забезпечити всю групу необхідними матеріалами.</w:t>
+            </w:r>
+          </w:p>
+        </w:tc>
+      </w:tr>
+      <w:tr>
+        <w:trPr>
+          <w:cantSplit w:val="0"/>
+          <w:tblHeader w:val="0"/>
+        </w:trPr>
+        <w:tc>
+          <w:tcPr>
+            <w:vMerge w:val="restart"/>
+            <w:tcBorders>
+              <w:top w:color="000000" w:space="0" w:sz="4" w:val="single"/>
+              <w:left w:color="000000" w:space="0" w:sz="4" w:val="single"/>
+              <w:bottom w:color="000000" w:space="0" w:sz="4" w:val="single"/>
+              <w:right w:color="000000" w:space="0" w:sz="4" w:val="single"/>
+            </w:tcBorders>
+            <w:shd w:fill="ffffff" w:val="clear"/>
+            <w:tcMar>
+              <w:top w:w="60.0" w:type="dxa"/>
+              <w:left w:w="100.0" w:type="dxa"/>
+              <w:bottom w:w="60.0" w:type="dxa"/>
+              <w:right w:w="100.0" w:type="dxa"/>
+            </w:tcMar>
+            <w:vAlign w:val="center"/>
+          </w:tcPr>
+          <w:p>
+            <w:pPr>
+              <w:spacing w:after="0" w:line="240" w:lineRule="auto"/>
+              <w:jc w:val="center"/>
+              <w:rPr>
+                <w:rFonts w:ascii="Arial" w:cs="Arial" w:eastAsia="Arial" w:hAnsi="Arial"/>
+                <w:sz w:val="22"/>
+                <w:szCs w:val="22"/>
+              </w:rPr>
+            </w:pPr>
+            <w:r>
+              <w:rPr>
+                <w:rFonts w:ascii="Arial" w:cs="Arial" w:eastAsia="Arial" w:hAnsi="Arial"/>
+                <w:sz w:val="22"/>
+                <w:szCs w:val="22"/>
+                <w:rtl w:val="0"/>
+              </w:rPr>
+              <w:t xml:space="preserve">Адміністратор</w:t>
+            </w:r>
+          </w:p>
+        </w:tc>
+        <w:tc>
+          <w:tcPr>
+            <w:tcBorders>
+              <w:top w:color="000000" w:space="0" w:sz="4" w:val="single"/>
+              <w:left w:color="000000" w:space="0" w:sz="4" w:val="single"/>
+              <w:bottom w:color="000000" w:space="0" w:sz="4" w:val="single"/>
+              <w:right w:color="000000" w:space="0" w:sz="4" w:val="single"/>
+            </w:tcBorders>
+            <w:shd w:fill="ffffff" w:val="clear"/>
+            <w:tcMar>
+              <w:top w:w="60.0" w:type="dxa"/>
+              <w:left w:w="100.0" w:type="dxa"/>
+              <w:bottom w:w="60.0" w:type="dxa"/>
+              <w:right w:w="100.0" w:type="dxa"/>
+            </w:tcMar>
+            <w:vAlign w:val="center"/>
+          </w:tcPr>
+          <w:p>
+            <w:pPr>
+              <w:spacing w:after="0" w:line="240" w:lineRule="auto"/>
+              <w:rPr>
+                <w:rFonts w:ascii="Arial" w:cs="Arial" w:eastAsia="Arial" w:hAnsi="Arial"/>
+                <w:sz w:val="22"/>
+                <w:szCs w:val="22"/>
+              </w:rPr>
+            </w:pPr>
+            <w:r>
+              <w:rPr>
+                <w:rFonts w:ascii="Arial" w:cs="Arial" w:eastAsia="Arial" w:hAnsi="Arial"/>
+                <w:sz w:val="22"/>
+                <w:szCs w:val="22"/>
+                <w:rtl w:val="0"/>
+              </w:rPr>
+              <w:t xml:space="preserve">Переглянути список усіх зареєстрованих користувачів, щоб мати повну інформацію про учасників системи.</w:t>
+            </w:r>
+          </w:p>
+        </w:tc>
+      </w:tr>
+      <w:tr>
+        <w:trPr>
+          <w:cantSplit w:val="0"/>
+          <w:tblHeader w:val="0"/>
+        </w:trPr>
+        <w:tc>
+          <w:tcPr>
+            <w:vMerge w:val="continue"/>
+            <w:tcBorders>
+              <w:top w:color="000000" w:space="0" w:sz="4" w:val="single"/>
+              <w:left w:color="000000" w:space="0" w:sz="4" w:val="single"/>
+              <w:bottom w:color="000000" w:space="0" w:sz="4" w:val="single"/>
+              <w:right w:color="000000" w:space="0" w:sz="4" w:val="single"/>
+            </w:tcBorders>
+            <w:shd w:fill="ffffff" w:val="clear"/>
+            <w:tcMar>
+              <w:top w:w="60.0" w:type="dxa"/>
+              <w:left w:w="100.0" w:type="dxa"/>
+              <w:bottom w:w="60.0" w:type="dxa"/>
+              <w:right w:w="100.0" w:type="dxa"/>
+            </w:tcMar>
+            <w:vAlign w:val="center"/>
+          </w:tcPr>
+          <w:p>
+            <w:pPr>
+              <w:widowControl w:val="0"/>
+              <w:spacing w:after="0" w:line="276" w:lineRule="auto"/>
+              <w:rPr>
+                <w:rFonts w:ascii="Arial" w:cs="Arial" w:eastAsia="Arial" w:hAnsi="Arial"/>
+                <w:sz w:val="22"/>
+                <w:szCs w:val="22"/>
+              </w:rPr>
+            </w:pPr>
+            <w:r>
+              <w:rPr>
+                <w:rtl w:val="0"/>
+              </w:rPr>
+            </w:r>
+          </w:p>
+        </w:tc>
+        <w:tc>
+          <w:tcPr>
+            <w:tcBorders>
+              <w:top w:color="000000" w:space="0" w:sz="4" w:val="single"/>
+              <w:left w:color="000000" w:space="0" w:sz="4" w:val="single"/>
+              <w:bottom w:color="000000" w:space="0" w:sz="4" w:val="single"/>
+              <w:right w:color="000000" w:space="0" w:sz="4" w:val="single"/>
+            </w:tcBorders>
+            <w:shd w:fill="ffffff" w:val="clear"/>
+            <w:tcMar>
+              <w:top w:w="60.0" w:type="dxa"/>
+              <w:left w:w="100.0" w:type="dxa"/>
+              <w:bottom w:w="60.0" w:type="dxa"/>
+              <w:right w:w="100.0" w:type="dxa"/>
+            </w:tcMar>
+            <w:vAlign w:val="center"/>
+          </w:tcPr>
+          <w:p>
+            <w:pPr>
+              <w:spacing w:after="0" w:line="240" w:lineRule="auto"/>
+              <w:rPr>
+                <w:rFonts w:ascii="Arial" w:cs="Arial" w:eastAsia="Arial" w:hAnsi="Arial"/>
+                <w:sz w:val="22"/>
+                <w:szCs w:val="22"/>
+              </w:rPr>
+            </w:pPr>
+            <w:r>
+              <w:rPr>
+                <w:rFonts w:ascii="Arial" w:cs="Arial" w:eastAsia="Arial" w:hAnsi="Arial"/>
+                <w:sz w:val="22"/>
+                <w:szCs w:val="22"/>
+                <w:rtl w:val="0"/>
+              </w:rPr>
+              <w:t xml:space="preserve">Оновити особисту інформацію студента, щоб виправити некоректні дані в профілі.</w:t>
+            </w:r>
+          </w:p>
+        </w:tc>
+      </w:tr>
+      <w:tr>
+        <w:trPr>
+          <w:cantSplit w:val="0"/>
+          <w:tblHeader w:val="0"/>
+        </w:trPr>
+        <w:tc>
+          <w:tcPr>
+            <w:vMerge w:val="continue"/>
+            <w:tcBorders>
+              <w:top w:color="000000" w:space="0" w:sz="4" w:val="single"/>
+              <w:left w:color="000000" w:space="0" w:sz="4" w:val="single"/>
+              <w:bottom w:color="000000" w:space="0" w:sz="4" w:val="single"/>
+              <w:right w:color="000000" w:space="0" w:sz="4" w:val="single"/>
+            </w:tcBorders>
+            <w:shd w:fill="ffffff" w:val="clear"/>
+            <w:tcMar>
+              <w:top w:w="60.0" w:type="dxa"/>
+              <w:left w:w="100.0" w:type="dxa"/>
+              <w:bottom w:w="60.0" w:type="dxa"/>
+              <w:right w:w="100.0" w:type="dxa"/>
+            </w:tcMar>
+            <w:vAlign w:val="center"/>
+          </w:tcPr>
+          <w:p>
+            <w:pPr>
+              <w:widowControl w:val="0"/>
+              <w:spacing w:after="0" w:line="276" w:lineRule="auto"/>
+              <w:rPr>
+                <w:rFonts w:ascii="Arial" w:cs="Arial" w:eastAsia="Arial" w:hAnsi="Arial"/>
+                <w:sz w:val="22"/>
+                <w:szCs w:val="22"/>
+              </w:rPr>
+            </w:pPr>
+            <w:r>
+              <w:rPr>
+                <w:rtl w:val="0"/>
+              </w:rPr>
+            </w:r>
+          </w:p>
+        </w:tc>
+        <w:tc>
+          <w:tcPr>
+            <w:tcBorders>
+              <w:top w:color="000000" w:space="0" w:sz="4" w:val="single"/>
+              <w:left w:color="000000" w:space="0" w:sz="4" w:val="single"/>
+              <w:bottom w:color="000000" w:space="0" w:sz="4" w:val="single"/>
+              <w:right w:color="000000" w:space="0" w:sz="4" w:val="single"/>
+            </w:tcBorders>
+            <w:shd w:fill="ffffff" w:val="clear"/>
+            <w:tcMar>
+              <w:top w:w="60.0" w:type="dxa"/>
+              <w:left w:w="100.0" w:type="dxa"/>
+              <w:bottom w:w="60.0" w:type="dxa"/>
+              <w:right w:w="100.0" w:type="dxa"/>
+            </w:tcMar>
+            <w:vAlign w:val="center"/>
+          </w:tcPr>
+          <w:p>
+            <w:pPr>
+              <w:spacing w:after="0" w:line="240" w:lineRule="auto"/>
+              <w:rPr>
+                <w:rFonts w:ascii="Arial" w:cs="Arial" w:eastAsia="Arial" w:hAnsi="Arial"/>
+                <w:sz w:val="22"/>
+                <w:szCs w:val="22"/>
+              </w:rPr>
+            </w:pPr>
+            <w:r>
+              <w:rPr>
+                <w:rFonts w:ascii="Arial" w:cs="Arial" w:eastAsia="Arial" w:hAnsi="Arial"/>
+                <w:sz w:val="22"/>
+                <w:szCs w:val="22"/>
+                <w:rtl w:val="0"/>
+              </w:rPr>
+              <w:t xml:space="preserve">Змінити групу користувача, щоб коректно відобразити його належність до академічної групи.</w:t>
+            </w:r>
+          </w:p>
+        </w:tc>
+      </w:tr>
+      <w:tr>
+        <w:trPr>
+          <w:cantSplit w:val="0"/>
+          <w:tblHeader w:val="0"/>
+        </w:trPr>
+        <w:tc>
+          <w:tcPr>
+            <w:vMerge w:val="continue"/>
+            <w:tcBorders>
+              <w:top w:color="000000" w:space="0" w:sz="4" w:val="single"/>
+              <w:left w:color="000000" w:space="0" w:sz="4" w:val="single"/>
+              <w:bottom w:color="000000" w:space="0" w:sz="4" w:val="single"/>
+              <w:right w:color="000000" w:space="0" w:sz="4" w:val="single"/>
+            </w:tcBorders>
+            <w:shd w:fill="ffffff" w:val="clear"/>
+            <w:tcMar>
+              <w:top w:w="60.0" w:type="dxa"/>
+              <w:left w:w="100.0" w:type="dxa"/>
+              <w:bottom w:w="60.0" w:type="dxa"/>
+              <w:right w:w="100.0" w:type="dxa"/>
+            </w:tcMar>
+            <w:vAlign w:val="center"/>
+          </w:tcPr>
+          <w:p>
+            <w:pPr>
+              <w:widowControl w:val="0"/>
+              <w:spacing w:after="0" w:line="276" w:lineRule="auto"/>
+              <w:rPr>
+                <w:rFonts w:ascii="Arial" w:cs="Arial" w:eastAsia="Arial" w:hAnsi="Arial"/>
+                <w:sz w:val="22"/>
+                <w:szCs w:val="22"/>
+              </w:rPr>
+            </w:pPr>
+            <w:r>
+              <w:rPr>
+                <w:rtl w:val="0"/>
+              </w:rPr>
+            </w:r>
+          </w:p>
+        </w:tc>
+        <w:tc>
+          <w:tcPr>
+            <w:tcBorders>
+              <w:top w:color="000000" w:space="0" w:sz="4" w:val="single"/>
+              <w:left w:color="000000" w:space="0" w:sz="4" w:val="single"/>
+              <w:bottom w:color="000000" w:space="0" w:sz="4" w:val="single"/>
+              <w:right w:color="000000" w:space="0" w:sz="4" w:val="single"/>
+            </w:tcBorders>
+            <w:shd w:fill="ffffff" w:val="clear"/>
+            <w:tcMar>
+              <w:top w:w="60.0" w:type="dxa"/>
+              <w:left w:w="100.0" w:type="dxa"/>
+              <w:bottom w:w="60.0" w:type="dxa"/>
+              <w:right w:w="100.0" w:type="dxa"/>
+            </w:tcMar>
+            <w:vAlign w:val="center"/>
+          </w:tcPr>
+          <w:p>
+            <w:pPr>
+              <w:spacing w:after="0" w:line="240" w:lineRule="auto"/>
+              <w:rPr>
+                <w:rFonts w:ascii="Arial" w:cs="Arial" w:eastAsia="Arial" w:hAnsi="Arial"/>
+                <w:sz w:val="22"/>
+                <w:szCs w:val="22"/>
+              </w:rPr>
+            </w:pPr>
+            <w:r>
+              <w:rPr>
+                <w:rFonts w:ascii="Arial" w:cs="Arial" w:eastAsia="Arial" w:hAnsi="Arial"/>
+                <w:sz w:val="22"/>
+                <w:szCs w:val="22"/>
+                <w:rtl w:val="0"/>
+              </w:rPr>
+              <w:t xml:space="preserve">Призначити роль користувачу (Студент, Староста, Адміністратор), щоб надати йому відповідні права доступу.</w:t>
+            </w:r>
+          </w:p>
+        </w:tc>
+      </w:tr>
+      <w:tr>
+        <w:trPr>
+          <w:cantSplit w:val="0"/>
+          <w:tblHeader w:val="0"/>
+        </w:trPr>
+        <w:tc>
+          <w:tcPr>
+            <w:vMerge w:val="continue"/>
+            <w:tcBorders>
+              <w:top w:color="000000" w:space="0" w:sz="4" w:val="single"/>
+              <w:left w:color="000000" w:space="0" w:sz="4" w:val="single"/>
+              <w:bottom w:color="000000" w:space="0" w:sz="4" w:val="single"/>
+              <w:right w:color="000000" w:space="0" w:sz="4" w:val="single"/>
+            </w:tcBorders>
+            <w:shd w:fill="ffffff" w:val="clear"/>
+            <w:tcMar>
+              <w:top w:w="60.0" w:type="dxa"/>
+              <w:left w:w="100.0" w:type="dxa"/>
+              <w:bottom w:w="60.0" w:type="dxa"/>
+              <w:right w:w="100.0" w:type="dxa"/>
+            </w:tcMar>
+            <w:vAlign w:val="center"/>
+          </w:tcPr>
+          <w:p>
+            <w:pPr>
+              <w:widowControl w:val="0"/>
+              <w:spacing w:after="0" w:line="276" w:lineRule="auto"/>
+              <w:rPr>
+                <w:rFonts w:ascii="Arial" w:cs="Arial" w:eastAsia="Arial" w:hAnsi="Arial"/>
+                <w:sz w:val="22"/>
+                <w:szCs w:val="22"/>
+              </w:rPr>
+            </w:pPr>
+            <w:r>
+              <w:rPr>
+                <w:rtl w:val="0"/>
+              </w:rPr>
+            </w:r>
+          </w:p>
+        </w:tc>
+        <w:tc>
+          <w:tcPr>
+            <w:tcBorders>
+              <w:top w:color="000000" w:space="0" w:sz="4" w:val="single"/>
+              <w:left w:color="000000" w:space="0" w:sz="4" w:val="single"/>
+              <w:bottom w:color="000000" w:space="0" w:sz="4" w:val="single"/>
+              <w:right w:color="000000" w:space="0" w:sz="4" w:val="single"/>
+            </w:tcBorders>
+            <w:shd w:fill="ffffff" w:val="clear"/>
+            <w:tcMar>
+              <w:top w:w="60.0" w:type="dxa"/>
+              <w:left w:w="100.0" w:type="dxa"/>
+              <w:bottom w:w="60.0" w:type="dxa"/>
+              <w:right w:w="100.0" w:type="dxa"/>
+            </w:tcMar>
+            <w:vAlign w:val="center"/>
+          </w:tcPr>
+          <w:p>
+            <w:pPr>
+              <w:spacing w:after="0" w:line="240" w:lineRule="auto"/>
+              <w:rPr>
+                <w:rFonts w:ascii="Arial" w:cs="Arial" w:eastAsia="Arial" w:hAnsi="Arial"/>
+                <w:sz w:val="22"/>
+                <w:szCs w:val="22"/>
+              </w:rPr>
+            </w:pPr>
+            <w:r>
+              <w:rPr>
+                <w:rFonts w:ascii="Arial" w:cs="Arial" w:eastAsia="Arial" w:hAnsi="Arial"/>
+                <w:sz w:val="22"/>
+                <w:szCs w:val="22"/>
+                <w:rtl w:val="0"/>
+              </w:rPr>
+              <w:t xml:space="preserve">Видалити обліковий запис користувача, щоб прибрати неактуальний або некоректний запис із системи.</w:t>
+            </w:r>
+          </w:p>
+        </w:tc>
+      </w:tr>
+      <w:tr>
+        <w:trPr>
+          <w:cantSplit w:val="0"/>
+          <w:tblHeader w:val="0"/>
+        </w:trPr>
+        <w:tc>
+          <w:tcPr>
+            <w:vMerge w:val="continue"/>
+            <w:tcBorders>
+              <w:top w:color="000000" w:space="0" w:sz="4" w:val="single"/>
+              <w:left w:color="000000" w:space="0" w:sz="4" w:val="single"/>
+              <w:bottom w:color="000000" w:space="0" w:sz="4" w:val="single"/>
+              <w:right w:color="000000" w:space="0" w:sz="4" w:val="single"/>
+            </w:tcBorders>
+            <w:shd w:fill="ffffff" w:val="clear"/>
+            <w:tcMar>
+              <w:top w:w="60.0" w:type="dxa"/>
+              <w:left w:w="100.0" w:type="dxa"/>
+              <w:bottom w:w="60.0" w:type="dxa"/>
+              <w:right w:w="100.0" w:type="dxa"/>
+            </w:tcMar>
+            <w:vAlign w:val="center"/>
+          </w:tcPr>
+          <w:p>
+            <w:pPr>
+              <w:widowControl w:val="0"/>
+              <w:spacing w:after="0" w:line="276" w:lineRule="auto"/>
+              <w:rPr>
+                <w:rFonts w:ascii="Arial" w:cs="Arial" w:eastAsia="Arial" w:hAnsi="Arial"/>
+                <w:sz w:val="22"/>
+                <w:szCs w:val="22"/>
+              </w:rPr>
+            </w:pPr>
+            <w:r>
+              <w:rPr>
+                <w:rtl w:val="0"/>
+              </w:rPr>
+            </w:r>
+          </w:p>
+        </w:tc>
+        <w:tc>
+          <w:tcPr>
+            <w:tcBorders>
+              <w:top w:color="000000" w:space="0" w:sz="4" w:val="single"/>
+              <w:left w:color="000000" w:space="0" w:sz="4" w:val="single"/>
+              <w:bottom w:color="000000" w:space="0" w:sz="4" w:val="single"/>
+              <w:right w:color="000000" w:space="0" w:sz="4" w:val="single"/>
+            </w:tcBorders>
+            <w:shd w:fill="ffffff" w:val="clear"/>
+            <w:tcMar>
+              <w:top w:w="60.0" w:type="dxa"/>
+              <w:left w:w="100.0" w:type="dxa"/>
+              <w:bottom w:w="60.0" w:type="dxa"/>
+              <w:right w:w="100.0" w:type="dxa"/>
+            </w:tcMar>
+            <w:vAlign w:val="center"/>
+          </w:tcPr>
+          <w:p>
+            <w:pPr>
+              <w:spacing w:after="0" w:line="240" w:lineRule="auto"/>
+              <w:rPr>
+                <w:rFonts w:ascii="Arial" w:cs="Arial" w:eastAsia="Arial" w:hAnsi="Arial"/>
+                <w:sz w:val="22"/>
+                <w:szCs w:val="22"/>
+              </w:rPr>
+            </w:pPr>
+            <w:r>
+              <w:rPr>
+                <w:rFonts w:ascii="Arial" w:cs="Arial" w:eastAsia="Arial" w:hAnsi="Arial"/>
+                <w:sz w:val="22"/>
+                <w:szCs w:val="22"/>
+                <w:rtl w:val="0"/>
+              </w:rPr>
+              <w:t xml:space="preserve">Надіслати миттєву розсилку всім користувачам, щоб оперативно повідомляти важливу інформацію.</w:t>
+            </w:r>
+          </w:p>
+        </w:tc>
+      </w:tr>
+      <w:tr>
+        <w:trPr>
+          <w:cantSplit w:val="0"/>
+          <w:tblHeader w:val="0"/>
+        </w:trPr>
+        <w:tc>
+          <w:tcPr>
+            <w:vMerge w:val="continue"/>
+            <w:tcBorders>
+              <w:top w:color="000000" w:space="0" w:sz="4" w:val="single"/>
+              <w:left w:color="000000" w:space="0" w:sz="4" w:val="single"/>
+              <w:bottom w:color="000000" w:space="0" w:sz="4" w:val="single"/>
+              <w:right w:color="000000" w:space="0" w:sz="4" w:val="single"/>
+            </w:tcBorders>
+            <w:shd w:fill="ffffff" w:val="clear"/>
+            <w:tcMar>
+              <w:top w:w="60.0" w:type="dxa"/>
+              <w:left w:w="100.0" w:type="dxa"/>
+              <w:bottom w:w="60.0" w:type="dxa"/>
+              <w:right w:w="100.0" w:type="dxa"/>
+            </w:tcMar>
+            <w:vAlign w:val="center"/>
+          </w:tcPr>
+          <w:p>
+            <w:pPr>
+              <w:widowControl w:val="0"/>
+              <w:spacing w:after="0" w:line="276" w:lineRule="auto"/>
+              <w:rPr>
+                <w:rFonts w:ascii="Arial" w:cs="Arial" w:eastAsia="Arial" w:hAnsi="Arial"/>
+                <w:sz w:val="22"/>
+                <w:szCs w:val="22"/>
+              </w:rPr>
+            </w:pPr>
+            <w:r>
+              <w:rPr>
+                <w:rtl w:val="0"/>
+              </w:rPr>
+            </w:r>
+          </w:p>
+        </w:tc>
+        <w:tc>
+          <w:tcPr>
+            <w:tcBorders>
+              <w:top w:color="000000" w:space="0" w:sz="4" w:val="single"/>
+              <w:left w:color="000000" w:space="0" w:sz="4" w:val="single"/>
+              <w:bottom w:color="000000" w:space="0" w:sz="4" w:val="single"/>
+              <w:right w:color="000000" w:space="0" w:sz="4" w:val="single"/>
+            </w:tcBorders>
+            <w:shd w:fill="ffffff" w:val="clear"/>
+            <w:tcMar>
+              <w:top w:w="60.0" w:type="dxa"/>
+              <w:left w:w="100.0" w:type="dxa"/>
+              <w:bottom w:w="60.0" w:type="dxa"/>
+              <w:right w:w="100.0" w:type="dxa"/>
+            </w:tcMar>
+            <w:vAlign w:val="center"/>
+          </w:tcPr>
+          <w:p>
+            <w:pPr>
+              <w:spacing w:after="0" w:line="240" w:lineRule="auto"/>
+              <w:rPr>
+                <w:rFonts w:ascii="Arial" w:cs="Arial" w:eastAsia="Arial" w:hAnsi="Arial"/>
+                <w:sz w:val="22"/>
+                <w:szCs w:val="22"/>
+              </w:rPr>
+            </w:pPr>
+            <w:r>
+              <w:rPr>
+                <w:rFonts w:ascii="Arial" w:cs="Arial" w:eastAsia="Arial" w:hAnsi="Arial"/>
+                <w:sz w:val="22"/>
+                <w:szCs w:val="22"/>
+                <w:rtl w:val="0"/>
+              </w:rPr>
+              <w:t xml:space="preserve">Переглянути статистику застосунку (кількість користувачів, завдань, файлів, активність), щоб оцінювати стан системи.</w:t>
+            </w:r>
+          </w:p>
+        </w:tc>
+      </w:tr>
+      <w:tr>
+        <w:trPr>
+          <w:cantSplit w:val="0"/>
+          <w:tblHeader w:val="0"/>
+        </w:trPr>
+        <w:tc>
+          <w:tcPr>
+            <w:vMerge w:val="continue"/>
+            <w:tcBorders>
+              <w:top w:color="000000" w:space="0" w:sz="4" w:val="single"/>
+              <w:left w:color="000000" w:space="0" w:sz="4" w:val="single"/>
+              <w:bottom w:color="000000" w:space="0" w:sz="4" w:val="single"/>
+              <w:right w:color="000000" w:space="0" w:sz="4" w:val="single"/>
+            </w:tcBorders>
+            <w:shd w:fill="ffffff" w:val="clear"/>
+            <w:tcMar>
+              <w:top w:w="60.0" w:type="dxa"/>
+              <w:left w:w="100.0" w:type="dxa"/>
+              <w:bottom w:w="60.0" w:type="dxa"/>
+              <w:right w:w="100.0" w:type="dxa"/>
+            </w:tcMar>
+            <w:vAlign w:val="center"/>
+          </w:tcPr>
+          <w:p>
+            <w:pPr>
+              <w:widowControl w:val="0"/>
+              <w:spacing w:after="0" w:line="276" w:lineRule="auto"/>
+              <w:rPr>
+                <w:rFonts w:ascii="Arial" w:cs="Arial" w:eastAsia="Arial" w:hAnsi="Arial"/>
+                <w:sz w:val="22"/>
+                <w:szCs w:val="22"/>
+              </w:rPr>
+            </w:pPr>
+            <w:r>
+              <w:rPr>
+                <w:rtl w:val="0"/>
+              </w:rPr>
+            </w:r>
+          </w:p>
+        </w:tc>
+        <w:tc>
+          <w:tcPr>
+            <w:tcBorders>
+              <w:top w:color="000000" w:space="0" w:sz="4" w:val="single"/>
+              <w:left w:color="000000" w:space="0" w:sz="4" w:val="single"/>
+              <w:bottom w:color="000000" w:space="0" w:sz="4" w:val="single"/>
+              <w:right w:color="000000" w:space="0" w:sz="4" w:val="single"/>
+            </w:tcBorders>
+            <w:shd w:fill="ffffff" w:val="clear"/>
+            <w:tcMar>
+              <w:top w:w="60.0" w:type="dxa"/>
+              <w:left w:w="100.0" w:type="dxa"/>
+              <w:bottom w:w="60.0" w:type="dxa"/>
+              <w:right w:w="100.0" w:type="dxa"/>
+            </w:tcMar>
+            <w:vAlign w:val="center"/>
+          </w:tcPr>
+          <w:p>
+            <w:pPr>
+              <w:spacing w:after="0" w:line="240" w:lineRule="auto"/>
+              <w:rPr>
+                <w:rFonts w:ascii="Arial" w:cs="Arial" w:eastAsia="Arial" w:hAnsi="Arial"/>
+                <w:sz w:val="22"/>
+                <w:szCs w:val="22"/>
+              </w:rPr>
+            </w:pPr>
+            <w:r>
+              <w:rPr>
+                <w:rFonts w:ascii="Arial" w:cs="Arial" w:eastAsia="Arial" w:hAnsi="Arial"/>
+                <w:sz w:val="22"/>
+                <w:szCs w:val="22"/>
+                <w:rtl w:val="0"/>
+              </w:rPr>
+              <w:t xml:space="preserve">Завантажити PDF-файл зі статистичними даними, щоб використовувати аналітику поза застосунком.</w:t>
+            </w:r>
+          </w:p>
+        </w:tc>
+      </w:tr>
+      <w:tr>
+        <w:trPr>
+          <w:cantSplit w:val="0"/>
+          <w:tblHeader w:val="0"/>
+        </w:trPr>
+        <w:tc>
+          <w:tcPr>
+            <w:vMerge w:val="continue"/>
+            <w:tcBorders>
+              <w:top w:color="000000" w:space="0" w:sz="4" w:val="single"/>
+              <w:left w:color="000000" w:space="0" w:sz="4" w:val="single"/>
+              <w:bottom w:color="000000" w:space="0" w:sz="4" w:val="single"/>
+              <w:right w:color="000000" w:space="0" w:sz="4" w:val="single"/>
+            </w:tcBorders>
+            <w:shd w:fill="ffffff" w:val="clear"/>
+            <w:tcMar>
+              <w:top w:w="60.0" w:type="dxa"/>
+              <w:left w:w="100.0" w:type="dxa"/>
+              <w:bottom w:w="60.0" w:type="dxa"/>
+              <w:right w:w="100.0" w:type="dxa"/>
+            </w:tcMar>
+            <w:vAlign w:val="center"/>
+          </w:tcPr>
+          <w:p>
+            <w:pPr>
+              <w:widowControl w:val="0"/>
+              <w:spacing w:after="0" w:line="276" w:lineRule="auto"/>
+              <w:rPr>
+                <w:rFonts w:ascii="Arial" w:cs="Arial" w:eastAsia="Arial" w:hAnsi="Arial"/>
+                <w:sz w:val="22"/>
+                <w:szCs w:val="22"/>
+              </w:rPr>
+            </w:pPr>
+            <w:r>
+              <w:rPr>
+                <w:rtl w:val="0"/>
+              </w:rPr>
+            </w:r>
+          </w:p>
+        </w:tc>
+        <w:tc>
+          <w:tcPr>
+            <w:tcBorders>
+              <w:top w:color="000000" w:space="0" w:sz="4" w:val="single"/>
+              <w:left w:color="000000" w:space="0" w:sz="4" w:val="single"/>
+              <w:bottom w:color="000000" w:space="0" w:sz="4" w:val="single"/>
+              <w:right w:color="000000" w:space="0" w:sz="4" w:val="single"/>
+            </w:tcBorders>
+            <w:shd w:fill="ffffff" w:val="clear"/>
+            <w:tcMar>
+              <w:top w:w="60.0" w:type="dxa"/>
+              <w:left w:w="100.0" w:type="dxa"/>
+              <w:bottom w:w="60.0" w:type="dxa"/>
+              <w:right w:w="100.0" w:type="dxa"/>
+            </w:tcMar>
+            <w:vAlign w:val="center"/>
+          </w:tcPr>
+          <w:p>
+            <w:pPr>
+              <w:spacing w:after="0" w:line="240" w:lineRule="auto"/>
+              <w:rPr>
+                <w:rFonts w:ascii="Arial" w:cs="Arial" w:eastAsia="Arial" w:hAnsi="Arial"/>
+                <w:sz w:val="22"/>
+                <w:szCs w:val="22"/>
+              </w:rPr>
+            </w:pPr>
+            <w:r>
+              <w:rPr>
+                <w:rFonts w:ascii="Arial" w:cs="Arial" w:eastAsia="Arial" w:hAnsi="Arial"/>
+                <w:sz w:val="22"/>
+                <w:szCs w:val="22"/>
+                <w:rtl w:val="0"/>
+              </w:rPr>
+              <w:t xml:space="preserve">Переглянути список запитів і відгуків від користувачів, щоб знати, які проблеми потребують вирішення.</w:t>
+            </w:r>
+          </w:p>
+        </w:tc>
+      </w:tr>
+      <w:tr>
+        <w:trPr>
+          <w:cantSplit w:val="0"/>
+          <w:tblHeader w:val="0"/>
+        </w:trPr>
+        <w:tc>
+          <w:tcPr>
+            <w:vMerge w:val="continue"/>
+            <w:tcBorders>
+              <w:top w:color="000000" w:space="0" w:sz="4" w:val="single"/>
+              <w:left w:color="000000" w:space="0" w:sz="4" w:val="single"/>
+              <w:bottom w:color="000000" w:space="0" w:sz="4" w:val="single"/>
+              <w:right w:color="000000" w:space="0" w:sz="4" w:val="single"/>
+            </w:tcBorders>
+            <w:shd w:fill="ffffff" w:val="clear"/>
+            <w:tcMar>
+              <w:top w:w="60.0" w:type="dxa"/>
+              <w:left w:w="100.0" w:type="dxa"/>
+              <w:bottom w:w="60.0" w:type="dxa"/>
+              <w:right w:w="100.0" w:type="dxa"/>
+            </w:tcMar>
+            <w:vAlign w:val="center"/>
+          </w:tcPr>
+          <w:p>
+            <w:pPr>
+              <w:widowControl w:val="0"/>
+              <w:spacing w:after="0" w:line="276" w:lineRule="auto"/>
+              <w:rPr>
+                <w:rFonts w:ascii="Arial" w:cs="Arial" w:eastAsia="Arial" w:hAnsi="Arial"/>
+                <w:sz w:val="22"/>
+                <w:szCs w:val="22"/>
+              </w:rPr>
+            </w:pPr>
+            <w:r>
+              <w:rPr>
+                <w:rtl w:val="0"/>
+              </w:rPr>
+            </w:r>
+          </w:p>
+        </w:tc>
+        <w:tc>
+          <w:tcPr>
+            <w:tcBorders>
+              <w:top w:color="000000" w:space="0" w:sz="4" w:val="single"/>
+              <w:left w:color="000000" w:space="0" w:sz="4" w:val="single"/>
+              <w:bottom w:color="000000" w:space="0" w:sz="4" w:val="single"/>
+              <w:right w:color="000000" w:space="0" w:sz="4" w:val="single"/>
+            </w:tcBorders>
+            <w:shd w:fill="ffffff" w:val="clear"/>
+            <w:tcMar>
+              <w:top w:w="60.0" w:type="dxa"/>
+              <w:left w:w="100.0" w:type="dxa"/>
+              <w:bottom w:w="60.0" w:type="dxa"/>
+              <w:right w:w="100.0" w:type="dxa"/>
+            </w:tcMar>
+            <w:vAlign w:val="center"/>
+          </w:tcPr>
+          <w:p>
+            <w:pPr>
+              <w:spacing w:after="0" w:line="240" w:lineRule="auto"/>
+              <w:rPr>
+                <w:rFonts w:ascii="Arial" w:cs="Arial" w:eastAsia="Arial" w:hAnsi="Arial"/>
+                <w:sz w:val="22"/>
+                <w:szCs w:val="22"/>
+              </w:rPr>
+            </w:pPr>
+            <w:r>
+              <w:rPr>
+                <w:rFonts w:ascii="Arial" w:cs="Arial" w:eastAsia="Arial" w:hAnsi="Arial"/>
+                <w:sz w:val="22"/>
+                <w:szCs w:val="22"/>
+                <w:rtl w:val="0"/>
+              </w:rPr>
+              <w:t xml:space="preserve">Змінити статус запиту та надати фідбек користувачу, щоб підтвердити обробку його звернення.</w:t>
+            </w:r>
+          </w:p>
+        </w:tc>
+      </w:tr>
+      <w:tr>
+        <w:trPr>
+          <w:cantSplit w:val="0"/>
+          <w:tblHeader w:val="0"/>
+        </w:trPr>
+        <w:tc>
+          <w:tcPr>
+            <w:vMerge w:val="continue"/>
+            <w:tcBorders>
+              <w:top w:color="000000" w:space="0" w:sz="4" w:val="single"/>
+              <w:left w:color="000000" w:space="0" w:sz="4" w:val="single"/>
+              <w:bottom w:color="000000" w:space="0" w:sz="4" w:val="single"/>
+              <w:right w:color="000000" w:space="0" w:sz="4" w:val="single"/>
+            </w:tcBorders>
+            <w:shd w:fill="ffffff" w:val="clear"/>
+            <w:tcMar>
+              <w:top w:w="60.0" w:type="dxa"/>
+              <w:left w:w="100.0" w:type="dxa"/>
+              <w:bottom w:w="60.0" w:type="dxa"/>
+              <w:right w:w="100.0" w:type="dxa"/>
+            </w:tcMar>
+            <w:vAlign w:val="center"/>
+          </w:tcPr>
+          <w:p>
+            <w:pPr>
+              <w:widowControl w:val="0"/>
+              <w:spacing w:after="0" w:line="276" w:lineRule="auto"/>
+              <w:rPr>
+                <w:rFonts w:ascii="Arial" w:cs="Arial" w:eastAsia="Arial" w:hAnsi="Arial"/>
+                <w:sz w:val="22"/>
+                <w:szCs w:val="22"/>
+              </w:rPr>
+            </w:pPr>
+            <w:r>
+              <w:rPr>
+                <w:rtl w:val="0"/>
+              </w:rPr>
+            </w:r>
+          </w:p>
+        </w:tc>
+        <w:tc>
+          <w:tcPr>
+            <w:tcBorders>
+              <w:top w:color="000000" w:space="0" w:sz="4" w:val="single"/>
+              <w:left w:color="000000" w:space="0" w:sz="4" w:val="single"/>
+              <w:bottom w:color="000000" w:space="0" w:sz="4" w:val="single"/>
+              <w:right w:color="000000" w:space="0" w:sz="4" w:val="single"/>
+            </w:tcBorders>
+            <w:shd w:fill="ffffff" w:val="clear"/>
+            <w:tcMar>
+              <w:top w:w="60.0" w:type="dxa"/>
+              <w:left w:w="100.0" w:type="dxa"/>
+              <w:bottom w:w="60.0" w:type="dxa"/>
+              <w:right w:w="100.0" w:type="dxa"/>
+            </w:tcMar>
+            <w:vAlign w:val="center"/>
+          </w:tcPr>
+          <w:p>
+            <w:pPr>
+              <w:spacing w:after="0" w:line="240" w:lineRule="auto"/>
+              <w:rPr>
+                <w:rFonts w:ascii="Arial" w:cs="Arial" w:eastAsia="Arial" w:hAnsi="Arial"/>
+                <w:sz w:val="22"/>
+                <w:szCs w:val="22"/>
+              </w:rPr>
+            </w:pPr>
+            <w:r>
+              <w:rPr>
+                <w:rFonts w:ascii="Arial" w:cs="Arial" w:eastAsia="Arial" w:hAnsi="Arial"/>
+                <w:sz w:val="22"/>
+                <w:szCs w:val="22"/>
+                <w:rtl w:val="0"/>
+              </w:rPr>
+              <w:t xml:space="preserve">Керувати системою автоматичного оновлення розкладу (вмикати/вимикати), щоб контролювати актуальність розкладів у системі.</w:t>
+            </w:r>
+          </w:p>
+        </w:tc>
+      </w:tr>
+      <w:tr>
+        <w:trPr>
+          <w:cantSplit w:val="0"/>
+          <w:tblHeader w:val="0"/>
+        </w:trPr>
+        <w:tc>
+          <w:tcPr>
+            <w:vMerge w:val="continue"/>
+            <w:tcBorders>
+              <w:top w:color="000000" w:space="0" w:sz="4" w:val="single"/>
+              <w:left w:color="000000" w:space="0" w:sz="4" w:val="single"/>
+              <w:bottom w:color="000000" w:space="0" w:sz="4" w:val="single"/>
+              <w:right w:color="000000" w:space="0" w:sz="4" w:val="single"/>
+            </w:tcBorders>
+            <w:shd w:fill="ffffff" w:val="clear"/>
+            <w:tcMar>
+              <w:top w:w="60.0" w:type="dxa"/>
+              <w:left w:w="100.0" w:type="dxa"/>
+              <w:bottom w:w="60.0" w:type="dxa"/>
+              <w:right w:w="100.0" w:type="dxa"/>
+            </w:tcMar>
+            <w:vAlign w:val="center"/>
+          </w:tcPr>
+          <w:p>
+            <w:pPr>
+              <w:widowControl w:val="0"/>
+              <w:spacing w:after="0" w:line="276" w:lineRule="auto"/>
+              <w:rPr>
+                <w:rFonts w:ascii="Arial" w:cs="Arial" w:eastAsia="Arial" w:hAnsi="Arial"/>
+                <w:sz w:val="22"/>
+                <w:szCs w:val="22"/>
+              </w:rPr>
+            </w:pPr>
+            <w:r>
+              <w:rPr>
+                <w:rtl w:val="0"/>
+              </w:rPr>
+            </w:r>
+          </w:p>
+        </w:tc>
+        <w:tc>
+          <w:tcPr>
+            <w:tcBorders>
+              <w:top w:color="000000" w:space="0" w:sz="4" w:val="single"/>
+              <w:left w:color="000000" w:space="0" w:sz="4" w:val="single"/>
+              <w:bottom w:color="000000" w:space="0" w:sz="4" w:val="single"/>
+              <w:right w:color="000000" w:space="0" w:sz="4" w:val="single"/>
+            </w:tcBorders>
+            <w:shd w:fill="ffffff" w:val="clear"/>
+            <w:tcMar>
+              <w:top w:w="60.0" w:type="dxa"/>
+              <w:left w:w="100.0" w:type="dxa"/>
+              <w:bottom w:w="60.0" w:type="dxa"/>
+              <w:right w:w="100.0" w:type="dxa"/>
+            </w:tcMar>
+            <w:vAlign w:val="center"/>
+          </w:tcPr>
+          <w:p>
+            <w:pPr>
+              <w:spacing w:after="0" w:line="240" w:lineRule="auto"/>
+              <w:rPr>
+                <w:rFonts w:ascii="Arial" w:cs="Arial" w:eastAsia="Arial" w:hAnsi="Arial"/>
+                <w:sz w:val="22"/>
+                <w:szCs w:val="22"/>
+              </w:rPr>
+            </w:pPr>
+            <w:r>
+              <w:rPr>
+                <w:rFonts w:ascii="Arial" w:cs="Arial" w:eastAsia="Arial" w:hAnsi="Arial"/>
+                <w:sz w:val="22"/>
+                <w:szCs w:val="22"/>
+                <w:rtl w:val="0"/>
+              </w:rPr>
+              <w:t xml:space="preserve">Видалити існуючий розклад для всіх або окремих груп, щоб прибрати застарілий або помилковий розклад.</w:t>
+            </w:r>
+          </w:p>
+        </w:tc>
+      </w:tr>
+    </w:tbl>
+    <w:p>
+      <w:pPr>
+        <w:widowControl w:val="0"/>
+        <w:spacing w:after="0" w:line="276" w:lineRule="auto"/>
+        <w:rPr/>
+      </w:pPr>
+      <w:r>
+        <w:rPr>
+          <w:rtl w:val="0"/>
+        </w:rPr>
+      </w:r>
+    </w:p>
+    <w:p>
+      <w:pPr>
         <w:rPr/>
       </w:pPr>
       <w:r>
@@ -5044,12 +7786,12 @@
           <wp:inline distB="114300" distT="114300" distL="114300" distR="114300">
             <wp:extent cx="6120455" cy="3467100"/>
             <wp:effectExtent b="0" l="0" r="0" t="0"/>
-            <wp:docPr id="6" name="image5.png"/>
+            <wp:docPr id="7" name="image6.png"/>
             <a:graphic>
               <a:graphicData uri="http://schemas.openxmlformats.org/drawingml/2006/picture">
                 <pic:pic>
                   <pic:nvPicPr>
-                    <pic:cNvPr id="0" name="image5.png"/>
+                    <pic:cNvPr id="0" name="image6.png"/>
                     <pic:cNvPicPr preferRelativeResize="0"/>
                   </pic:nvPicPr>
                   <pic:blipFill>
@@ -5088,12 +7830,12 @@
           <wp:inline distB="114300" distT="114300" distL="114300" distR="114300">
             <wp:extent cx="6120455" cy="6045200"/>
             <wp:effectExtent b="0" l="0" r="0" t="0"/>
-            <wp:docPr id="2" name="image7.png"/>
+            <wp:docPr id="6" name="image8.png"/>
             <a:graphic>
               <a:graphicData uri="http://schemas.openxmlformats.org/drawingml/2006/picture">
                 <pic:pic>
                   <pic:nvPicPr>
-                    <pic:cNvPr id="0" name="image7.png"/>
+                    <pic:cNvPr id="0" name="image8.png"/>
                     <pic:cNvPicPr preferRelativeResize="0"/>
                   </pic:nvPicPr>
                   <pic:blipFill>
@@ -5155,12 +7897,12 @@
           <wp:inline distB="114300" distT="114300" distL="114300" distR="114300">
             <wp:extent cx="6120455" cy="4622800"/>
             <wp:effectExtent b="0" l="0" r="0" t="0"/>
-            <wp:docPr id="7" name="image8.png"/>
+            <wp:docPr id="9" name="image3.png"/>
             <a:graphic>
               <a:graphicData uri="http://schemas.openxmlformats.org/drawingml/2006/picture">
                 <pic:pic>
                   <pic:nvPicPr>
-                    <pic:cNvPr id="0" name="image8.png"/>
+                    <pic:cNvPr id="0" name="image3.png"/>
                     <pic:cNvPicPr preferRelativeResize="0"/>
                   </pic:nvPicPr>
                   <pic:blipFill>
@@ -5252,12 +7994,12 @@
           <wp:inline distB="114300" distT="114300" distL="114300" distR="114300">
             <wp:extent cx="6120455" cy="4089400"/>
             <wp:effectExtent b="0" l="0" r="0" t="0"/>
-            <wp:docPr id="3" name="image4.png"/>
+            <wp:docPr id="8" name="image7.png"/>
             <a:graphic>
               <a:graphicData uri="http://schemas.openxmlformats.org/drawingml/2006/picture">
                 <pic:pic>
                   <pic:nvPicPr>
-                    <pic:cNvPr id="0" name="image4.png"/>
+                    <pic:cNvPr id="0" name="image7.png"/>
                     <pic:cNvPicPr preferRelativeResize="0"/>
                   </pic:nvPicPr>
                   <pic:blipFill>
@@ -5382,12 +8124,12 @@
           <wp:inline distB="114300" distT="114300" distL="114300" distR="114300">
             <wp:extent cx="6120455" cy="3149600"/>
             <wp:effectExtent b="0" l="0" r="0" t="0"/>
-            <wp:docPr id="9" name="image6.png"/>
+            <wp:docPr id="2" name="image1.png"/>
             <a:graphic>
               <a:graphicData uri="http://schemas.openxmlformats.org/drawingml/2006/picture">
                 <pic:pic>
                   <pic:nvPicPr>
-                    <pic:cNvPr id="0" name="image6.png"/>
+                    <pic:cNvPr id="0" name="image1.png"/>
                     <pic:cNvPicPr preferRelativeResize="0"/>
                   </pic:nvPicPr>
                   <pic:blipFill>
@@ -5487,12 +8229,12 @@
           <wp:inline distB="114300" distT="114300" distL="114300" distR="114300">
             <wp:extent cx="6120455" cy="4432300"/>
             <wp:effectExtent b="0" l="0" r="0" t="0"/>
-            <wp:docPr id="8" name="image9.png"/>
+            <wp:docPr id="1" name="image5.png"/>
             <a:graphic>
               <a:graphicData uri="http://schemas.openxmlformats.org/drawingml/2006/picture">
                 <pic:pic>
                   <pic:nvPicPr>
-                    <pic:cNvPr id="0" name="image9.png"/>
+                    <pic:cNvPr id="0" name="image5.png"/>
                     <pic:cNvPicPr preferRelativeResize="0"/>
                   </pic:nvPicPr>
                   <pic:blipFill>
@@ -5571,12 +8313,12 @@
           <wp:inline distB="114300" distT="114300" distL="114300" distR="114300">
             <wp:extent cx="6120455" cy="4076700"/>
             <wp:effectExtent b="0" l="0" r="0" t="0"/>
-            <wp:docPr id="1" name="image2.png"/>
+            <wp:docPr id="4" name="image4.png"/>
             <a:graphic>
               <a:graphicData uri="http://schemas.openxmlformats.org/drawingml/2006/picture">
                 <pic:pic>
                   <pic:nvPicPr>
-                    <pic:cNvPr id="0" name="image2.png"/>
+                    <pic:cNvPr id="0" name="image4.png"/>
                     <pic:cNvPicPr preferRelativeResize="0"/>
                   </pic:nvPicPr>
                   <pic:blipFill>
@@ -5668,12 +8410,12 @@
           <wp:inline distB="114300" distT="114300" distL="114300" distR="114300">
             <wp:extent cx="6120455" cy="3683000"/>
             <wp:effectExtent b="0" l="0" r="0" t="0"/>
-            <wp:docPr id="4" name="image3.png"/>
+            <wp:docPr id="3" name="image2.png"/>
             <a:graphic>
               <a:graphicData uri="http://schemas.openxmlformats.org/drawingml/2006/picture">
                 <pic:pic>
                   <pic:nvPicPr>
-                    <pic:cNvPr id="0" name="image3.png"/>
+                    <pic:cNvPr id="0" name="image2.png"/>
                     <pic:cNvPicPr preferRelativeResize="0"/>
                   </pic:nvPicPr>
                   <pic:blipFill>
@@ -6013,6 +8755,19 @@
         <w:left w:w="100.0" w:type="dxa"/>
         <w:bottom w:w="100.0" w:type="dxa"/>
         <w:right w:w="100.0" w:type="dxa"/>
+      </w:tblCellMar>
+    </w:tblPr>
+  </w:style>
+  <w:style w:type="table" w:styleId="Table3">
+    <w:basedOn w:val="TableNormal"/>
+    <w:tblPr>
+      <w:tblStyleRowBandSize w:val="1"/>
+      <w:tblStyleColBandSize w:val="1"/>
+      <w:tblCellMar>
+        <w:top w:w="0.0" w:type="dxa"/>
+        <w:left w:w="115.0" w:type="dxa"/>
+        <w:bottom w:w="0.0" w:type="dxa"/>
+        <w:right w:w="115.0" w:type="dxa"/>
       </w:tblCellMar>
     </w:tblPr>
   </w:style>

</xml_diff>

<commit_message>
Update use case diagram
</commit_message>
<xml_diff>
--- a/Documents/UseCase.docx
+++ b/Documents/UseCase.docx
@@ -850,6 +850,9 @@
         <w:tc>
           <w:tcPr>
             <w:vMerge w:val="continue"/>
+            <w:tcBorders>
+              <w:bottom w:color="ffffff" w:space="0" w:sz="4" w:val="single"/>
+            </w:tcBorders>
           </w:tcPr>
           <w:p>
             <w:pPr>
@@ -914,6 +917,74 @@
                 <w:rtl w:val="0"/>
               </w:rPr>
               <w:t xml:space="preserve">Студент/Староста може видалити завдання із особистої дошки.</w:t>
+            </w:r>
+          </w:p>
+        </w:tc>
+      </w:tr>
+      <w:tr>
+        <w:trPr>
+          <w:cantSplit w:val="0"/>
+          <w:trHeight w:val="887.9296875" w:hRule="atLeast"/>
+          <w:tblHeader w:val="0"/>
+        </w:trPr>
+        <w:tc>
+          <w:tcPr>
+            <w:tcBorders>
+              <w:top w:color="ffffff" w:space="0" w:sz="4" w:val="single"/>
+            </w:tcBorders>
+          </w:tcPr>
+          <w:p>
+            <w:pPr>
+              <w:keepNext w:val="0"/>
+              <w:keepLines w:val="0"/>
+              <w:pageBreakBefore w:val="0"/>
+              <w:widowControl w:val="0"/>
+              <w:pBdr>
+                <w:top w:space="0" w:sz="0" w:val="nil"/>
+                <w:left w:space="0" w:sz="0" w:val="nil"/>
+                <w:bottom w:space="0" w:sz="0" w:val="nil"/>
+                <w:right w:space="0" w:sz="0" w:val="nil"/>
+                <w:between w:space="0" w:sz="0" w:val="nil"/>
+              </w:pBdr>
+              <w:shd w:fill="auto" w:val="clear"/>
+              <w:spacing w:after="0" w:before="0" w:line="276" w:lineRule="auto"/>
+              <w:ind w:left="0" w:right="0" w:firstLine="0"/>
+              <w:jc w:val="left"/>
+              <w:rPr/>
+            </w:pPr>
+            <w:r>
+              <w:rPr>
+                <w:rtl w:val="0"/>
+              </w:rPr>
+            </w:r>
+          </w:p>
+        </w:tc>
+        <w:tc>
+          <w:tcPr/>
+          <w:p>
+            <w:pPr>
+              <w:jc w:val="both"/>
+              <w:rPr/>
+            </w:pPr>
+            <w:r>
+              <w:rPr>
+                <w:rtl w:val="0"/>
+              </w:rPr>
+              <w:t xml:space="preserve">Редагувати завдання </w:t>
+            </w:r>
+          </w:p>
+        </w:tc>
+        <w:tc>
+          <w:tcPr/>
+          <w:p>
+            <w:pPr>
+              <w:rPr/>
+            </w:pPr>
+            <w:r>
+              <w:rPr>
+                <w:rtl w:val="0"/>
+              </w:rPr>
+              <w:t xml:space="preserve">Студент/Староста може редагувати назву, опис та додати посилання на ресурс до існуючого завдання. </w:t>
             </w:r>
           </w:p>
         </w:tc>
@@ -8098,12 +8169,12 @@
           <wp:inline distB="114300" distT="114300" distL="114300" distR="114300">
             <wp:extent cx="6120455" cy="3467100"/>
             <wp:effectExtent b="0" l="0" r="0" t="0"/>
-            <wp:docPr id="7" name="image2.png"/>
+            <wp:docPr id="7" name="image5.png"/>
             <a:graphic>
               <a:graphicData uri="http://schemas.openxmlformats.org/drawingml/2006/picture">
                 <pic:pic>
                   <pic:nvPicPr>
-                    <pic:cNvPr id="0" name="image2.png"/>
+                    <pic:cNvPr id="0" name="image5.png"/>
                     <pic:cNvPicPr preferRelativeResize="0"/>
                   </pic:nvPicPr>
                   <pic:blipFill>
@@ -8142,12 +8213,12 @@
           <wp:inline distB="114300" distT="114300" distL="114300" distR="114300">
             <wp:extent cx="6120455" cy="6045200"/>
             <wp:effectExtent b="0" l="0" r="0" t="0"/>
-            <wp:docPr id="6" name="image4.png"/>
+            <wp:docPr id="6" name="image8.png"/>
             <a:graphic>
               <a:graphicData uri="http://schemas.openxmlformats.org/drawingml/2006/picture">
                 <pic:pic>
                   <pic:nvPicPr>
-                    <pic:cNvPr id="0" name="image4.png"/>
+                    <pic:cNvPr id="0" name="image8.png"/>
                     <pic:cNvPicPr preferRelativeResize="0"/>
                   </pic:nvPicPr>
                   <pic:blipFill>
@@ -8209,12 +8280,12 @@
           <wp:inline distB="114300" distT="114300" distL="114300" distR="114300">
             <wp:extent cx="6120455" cy="4622800"/>
             <wp:effectExtent b="0" l="0" r="0" t="0"/>
-            <wp:docPr id="9" name="image6.png"/>
+            <wp:docPr id="9" name="image1.png"/>
             <a:graphic>
               <a:graphicData uri="http://schemas.openxmlformats.org/drawingml/2006/picture">
                 <pic:pic>
                   <pic:nvPicPr>
-                    <pic:cNvPr id="0" name="image6.png"/>
+                    <pic:cNvPr id="0" name="image1.png"/>
                     <pic:cNvPicPr preferRelativeResize="0"/>
                   </pic:nvPicPr>
                   <pic:blipFill>
@@ -8306,12 +8377,12 @@
           <wp:inline distB="114300" distT="114300" distL="114300" distR="114300">
             <wp:extent cx="6120455" cy="4089400"/>
             <wp:effectExtent b="0" l="0" r="0" t="0"/>
-            <wp:docPr id="8" name="image7.png"/>
+            <wp:docPr id="8" name="image4.png"/>
             <a:graphic>
               <a:graphicData uri="http://schemas.openxmlformats.org/drawingml/2006/picture">
                 <pic:pic>
                   <pic:nvPicPr>
-                    <pic:cNvPr id="0" name="image7.png"/>
+                    <pic:cNvPr id="0" name="image4.png"/>
                     <pic:cNvPicPr preferRelativeResize="0"/>
                   </pic:nvPicPr>
                   <pic:blipFill>
@@ -8436,12 +8507,12 @@
           <wp:inline distB="114300" distT="114300" distL="114300" distR="114300">
             <wp:extent cx="6120455" cy="3149600"/>
             <wp:effectExtent b="0" l="0" r="0" t="0"/>
-            <wp:docPr id="2" name="image3.png"/>
+            <wp:docPr id="2" name="image6.png"/>
             <a:graphic>
               <a:graphicData uri="http://schemas.openxmlformats.org/drawingml/2006/picture">
                 <pic:pic>
                   <pic:nvPicPr>
-                    <pic:cNvPr id="0" name="image3.png"/>
+                    <pic:cNvPr id="0" name="image6.png"/>
                     <pic:cNvPicPr preferRelativeResize="0"/>
                   </pic:nvPicPr>
                   <pic:blipFill>
@@ -8541,12 +8612,12 @@
           <wp:inline distB="114300" distT="114300" distL="114300" distR="114300">
             <wp:extent cx="6120455" cy="4432300"/>
             <wp:effectExtent b="0" l="0" r="0" t="0"/>
-            <wp:docPr id="1" name="image8.png"/>
+            <wp:docPr id="1" name="image3.png"/>
             <a:graphic>
               <a:graphicData uri="http://schemas.openxmlformats.org/drawingml/2006/picture">
                 <pic:pic>
                   <pic:nvPicPr>
-                    <pic:cNvPr id="0" name="image8.png"/>
+                    <pic:cNvPr id="0" name="image3.png"/>
                     <pic:cNvPicPr preferRelativeResize="0"/>
                   </pic:nvPicPr>
                   <pic:blipFill>
@@ -8625,12 +8696,12 @@
           <wp:inline distB="114300" distT="114300" distL="114300" distR="114300">
             <wp:extent cx="6120455" cy="4076700"/>
             <wp:effectExtent b="0" l="0" r="0" t="0"/>
-            <wp:docPr id="4" name="image1.png"/>
+            <wp:docPr id="4" name="image7.png"/>
             <a:graphic>
               <a:graphicData uri="http://schemas.openxmlformats.org/drawingml/2006/picture">
                 <pic:pic>
                   <pic:nvPicPr>
-                    <pic:cNvPr id="0" name="image1.png"/>
+                    <pic:cNvPr id="0" name="image7.png"/>
                     <pic:cNvPicPr preferRelativeResize="0"/>
                   </pic:nvPicPr>
                   <pic:blipFill>
@@ -8722,12 +8793,12 @@
           <wp:inline distB="114300" distT="114300" distL="114300" distR="114300">
             <wp:extent cx="6120455" cy="3683000"/>
             <wp:effectExtent b="0" l="0" r="0" t="0"/>
-            <wp:docPr id="3" name="image5.png"/>
+            <wp:docPr id="3" name="image2.png"/>
             <a:graphic>
               <a:graphicData uri="http://schemas.openxmlformats.org/drawingml/2006/picture">
                 <pic:pic>
                   <pic:nvPicPr>
-                    <pic:cNvPr id="0" name="image5.png"/>
+                    <pic:cNvPr id="0" name="image2.png"/>
                     <pic:cNvPicPr preferRelativeResize="0"/>
                   </pic:nvPicPr>
                   <pic:blipFill>

</xml_diff>